<commit_message>
1.2.1 design agreed: D1-D6 as recommended, D7 scan needs 10 Ready, D8 no night change, D9 size-band discovery
Co-Authored-By: Claude Opus 5.5 <noreply@anthropic.com>
</commit_message>
<xml_diff>
--- a/ONBOARDING_RESEARCH_DESIGN.docx
+++ b/ONBOARDING_RESEARCH_DESIGN.docx
@@ -44,13 +44,13 @@
         <w:rPr>
           <w:b/>
         </w:rPr>
-        <w:t>Design — draft for review.</w:t>
-      </w:r>
-      <w:r>
-        <w:rPr>
-          <w:b w:val="0"/>
-        </w:rPr>
-        <w:t xml:space="preserve"> Decisions D1–D6 (section 12) wait for Boaz.</w:t>
+        <w:t>Design — agreed 2026-09-28.</w:t>
+      </w:r>
+      <w:r>
+        <w:rPr>
+          <w:b w:val="0"/>
+        </w:rPr>
+        <w:t xml:space="preserve"> Boaz agreed to every recommendation in D1–D9 (section 12).</w:t>
       </w:r>
     </w:p>
     <w:p>
@@ -4765,6 +4765,188 @@
       </w:r>
     </w:p>
     <w:p>
+      <w:r>
+        <w:rPr>
+          <w:b/>
+        </w:rPr>
+        <w:t>Size-targeted discovery (D9, agreed 2026-09-28).</w:t>
+      </w:r>
+      <w:r>
+        <w:rPr>
+          <w:b w:val="0"/>
+        </w:rPr>
+        <w:t xml:space="preserve"> The size bands are the wizard's own</w:t>
+      </w:r>
+    </w:p>
+    <w:p>
+      <w:r>
+        <w:rPr>
+          <w:b w:val="0"/>
+        </w:rPr>
+        <w:t>(</w:t>
+      </w:r>
+      <w:r>
+        <w:rPr>
+          <w:rFonts w:ascii="Consolas" w:hAnsi="Consolas"/>
+          <w:b w:val="0"/>
+        </w:rPr>
+        <w:t>SIZE_PRIORITY_BUCKETS</w:t>
+      </w:r>
+      <w:r>
+        <w:rPr>
+          <w:b w:val="0"/>
+        </w:rPr>
+        <w:t>: Small 0–200, Medium 201–500, Large 501–1,000, Extra Large 1,001–5,000, Extra</w:t>
+      </w:r>
+    </w:p>
+    <w:p>
+      <w:r>
+        <w:rPr>
+          <w:b w:val="0"/>
+        </w:rPr>
+        <w:t>Extra Large 5,001+), shown with their ranges on the Size step, where the user ticks the bands to cover —</w:t>
+      </w:r>
+    </w:p>
+    <w:p>
+      <w:r>
+        <w:rPr>
+          <w:b w:val="0"/>
+        </w:rPr>
+        <w:t>there is no standard definition, so the ranges are always visible. Discovery follows them:</w:t>
+      </w:r>
+    </w:p>
+    <w:p>
+      <w:pPr>
+        <w:pStyle w:val="ListBullet"/>
+      </w:pPr>
+      <w:r>
+        <w:rPr>
+          <w:b/>
+        </w:rPr>
+        <w:t>Listings match the bands.</w:t>
+      </w:r>
+      <w:r>
+        <w:rPr>
+          <w:b w:val="0"/>
+        </w:rPr>
+        <w:t xml:space="preserve"> A top-100-largest ranking is used only when the ticked bands are the</w:t>
+      </w:r>
+    </w:p>
+    <w:p>
+      <w:r>
+        <w:rPr>
+          <w:b w:val="0"/>
+        </w:rPr>
+        <w:t xml:space="preserve">  largest ones; otherwise the listing call asks for companies of the ticked range (by industry,</w:t>
+      </w:r>
+    </w:p>
+    <w:p>
+      <w:r>
+        <w:rPr>
+          <w:b w:val="0"/>
+        </w:rPr>
+        <w:t xml:space="preserve">  region or directory), never the largest ones by default (R7.1c).</w:t>
+      </w:r>
+    </w:p>
+    <w:p>
+      <w:pPr>
+        <w:pStyle w:val="ListBullet"/>
+      </w:pPr>
+      <w:r>
+        <w:rPr>
+          <w:b/>
+        </w:rPr>
+        <w:t>The target is split across the ticked bands in proportion to their priorities</w:t>
+      </w:r>
+      <w:r>
+        <w:rPr>
+          <w:b w:val="0"/>
+        </w:rPr>
+        <w:t xml:space="preserve"> (e.g. 100 accounts,</w:t>
+      </w:r>
+    </w:p>
+    <w:p>
+      <w:r>
+        <w:rPr>
+          <w:b w:val="0"/>
+        </w:rPr>
+        <w:t xml:space="preserve">  Large High and Medium Medium → about 60 and 40).</w:t>
+      </w:r>
+    </w:p>
+    <w:p>
+      <w:pPr>
+        <w:pStyle w:val="ListBullet"/>
+      </w:pPr>
+      <w:r>
+        <w:rPr>
+          <w:b/>
+        </w:rPr>
+        <w:t>Centre of the band first.</w:t>
+      </w:r>
+      <w:r>
+        <w:rPr>
+          <w:b w:val="0"/>
+        </w:rPr>
+        <w:t xml:space="preserve"> Within a band, candidates are ordered by how close their headcount is to</w:t>
+      </w:r>
+    </w:p>
+    <w:p>
+      <w:r>
+        <w:rPr>
+          <w:b w:val="0"/>
+        </w:rPr>
+        <w:t xml:space="preserve">  the band's log-scale midpoint (√(min × max): ~707 for Large, ~317 for Medium, ~2,236 for Extra Large;</w:t>
+      </w:r>
+    </w:p>
+    <w:p>
+      <w:r>
+        <w:rPr>
+          <w:b w:val="0"/>
+        </w:rPr>
+        <w:t xml:space="preserve">  Small and Extra Extra Large, open at one end, use 100 and 10,000). This replaces the idea of</w:t>
+      </w:r>
+    </w:p>
+    <w:p>
+      <w:r>
+        <w:rPr>
+          <w:b w:val="0"/>
+        </w:rPr>
+        <w:t xml:space="preserve">  collecting *all* companies of a band and taking 50 either side of its median: no free source lists</w:t>
+      </w:r>
+    </w:p>
+    <w:p>
+      <w:r>
+        <w:rPr>
+          <w:b w:val="0"/>
+        </w:rPr>
+        <w:t xml:space="preserve">  every company of a band with its headcount, and company counts rise steeply towards a band's lower</w:t>
+      </w:r>
+    </w:p>
+    <w:p>
+      <w:r>
+        <w:rPr>
+          <w:b w:val="0"/>
+        </w:rPr>
+        <w:t xml:space="preserve">  end, so its median would sit near the bottom. Fit still comes first: the centre distance ranks</w:t>
+      </w:r>
+    </w:p>
+    <w:p>
+      <w:r>
+        <w:rPr>
+          <w:b w:val="0"/>
+        </w:rPr>
+        <w:t xml:space="preserve">  candidates of equal pre-score, so a strong fit at the band's edge beats a weak fit at its centre.</w:t>
+      </w:r>
+    </w:p>
+    <w:p>
+      <w:r>
+        <w:rPr>
+          <w:b w:val="0"/>
+        </w:rPr>
+        <w:t xml:space="preserve">  Candidates without a headcount yet rank after those with one.</w:t>
+      </w:r>
+    </w:p>
+    <w:p>
       <w:pPr>
         <w:pStyle w:val="Heading3"/>
       </w:pPr>
@@ -5952,7 +6134,27 @@
         <w:rPr>
           <w:b w:val="0"/>
         </w:rPr>
-        <w:t xml:space="preserve">, the Ready bar, </w:t>
+        <w:t>, the Ready bar and the Scanner's</w:t>
+      </w:r>
+    </w:p>
+    <w:p>
+      <w:r>
+        <w:rPr>
+          <w:b w:val="0"/>
+        </w:rPr>
+        <w:t xml:space="preserve">selection are </w:t>
+      </w:r>
+      <w:r>
+        <w:rPr>
+          <w:b/>
+        </w:rPr>
+        <w:t>unchanged</w:t>
+      </w:r>
+      <w:r>
+        <w:rPr>
+          <w:b w:val="0"/>
+        </w:rPr>
+        <w:t xml:space="preserve"> (</w:t>
       </w:r>
       <w:r>
         <w:rPr>
@@ -5961,25 +6163,11 @@
         </w:rPr>
         <w:t>MIN_READY_TO_SCAN</w:t>
       </w:r>
-    </w:p>
-    <w:p>
-      <w:r>
-        <w:rPr>
-          <w:b w:val="0"/>
-        </w:rPr>
-        <w:t xml:space="preserve">(5) and the Scanner's selection are </w:t>
-      </w:r>
-      <w:r>
-        <w:rPr>
-          <w:b/>
-        </w:rPr>
-        <w:t>unchanged</w:t>
-      </w:r>
-      <w:r>
-        <w:rPr>
-          <w:b w:val="0"/>
-        </w:rPr>
-        <w:t>, so 1.2.0 R3.4 still holds for Ready (R3.4.2–3).</w:t>
+      <w:r>
+        <w:rPr>
+          <w:b w:val="0"/>
+        </w:rPr>
+        <w:t xml:space="preserve"> rises from 5 to 10, D7, section 7.3), so 1.2.0 R3.4 still holds for Ready (R3.4.2–3).</w:t>
       </w:r>
     </w:p>
     <w:p>
@@ -6413,6 +6601,235 @@
           <w:b w:val="0"/>
         </w:rPr>
         <w:t>People page usually gives in one.</w:t>
+      </w:r>
+    </w:p>
+    <w:p>
+      <w:pPr>
+        <w:pStyle w:val="Heading3"/>
+      </w:pPr>
+      <w:r>
+        <w:rPr>
+          <w:b w:val="0"/>
+        </w:rPr>
+        <w:t>7.3 The first 10 Ready, then the rest (D7, agreed 2026-09-28)</w:t>
+      </w:r>
+    </w:p>
+    <w:p>
+      <w:r>
+        <w:rPr>
+          <w:b w:val="0"/>
+        </w:rPr>
+        <w:t>A Leads scan over fewer than about 10 verified accounts is unlikely to find posts by target titles, and</w:t>
+      </w:r>
+    </w:p>
+    <w:p>
+      <w:r>
+        <w:rPr>
+          <w:b w:val="0"/>
+        </w:rPr>
+        <w:t>borrowing touches from the user's scanning room cannot work, because a scan the user starts later cannot</w:t>
+      </w:r>
+    </w:p>
+    <w:p>
+      <w:r>
+        <w:rPr>
+          <w:b w:val="0"/>
+        </w:rPr>
+        <w:t>be predicted and spent touches cannot be given back. So the first day trades a short wait for a useful</w:t>
+      </w:r>
+    </w:p>
+    <w:p>
+      <w:r>
+        <w:rPr>
+          <w:b w:val="0"/>
+        </w:rPr>
+        <w:t>first scan, and the ceiling is never raised:</w:t>
+      </w:r>
+    </w:p>
+    <w:p>
+      <w:pPr>
+        <w:pStyle w:val="ListBullet"/>
+      </w:pPr>
+      <w:r>
+        <w:rPr>
+          <w:b/>
+        </w:rPr>
+        <w:t>`MIN_READY_TO_SCAN` rises from 5 to 10</w:t>
+      </w:r>
+      <w:r>
+        <w:rPr>
+          <w:b w:val="0"/>
+        </w:rPr>
+        <w:t>, every day, not only the first (after day 1 the Ready count</w:t>
+      </w:r>
+    </w:p>
+    <w:p>
+      <w:r>
+        <w:rPr>
+          <w:b w:val="0"/>
+        </w:rPr>
+        <w:t xml:space="preserve">  only grows, so it is the same in practice and simpler). </w:t>
+      </w:r>
+      <w:r>
+        <w:rPr>
+          <w:b/>
+        </w:rPr>
+        <w:t>This changes 1.2.0 R12.3.4 (5).</w:t>
+      </w:r>
+      <w:r>
+        <w:rPr>
+          <w:b w:val="0"/>
+        </w:rPr>
+        <w:t xml:space="preserve"> The gate</w:t>
+      </w:r>
+    </w:p>
+    <w:p>
+      <w:r>
+        <w:rPr>
+          <w:b w:val="0"/>
+        </w:rPr>
+        <w:t xml:space="preserve">  stays soft: 0 Ready blocks the scan; 1–9 explain and offer </w:t>
+      </w:r>
+      <w:r>
+        <w:rPr>
+          <w:b/>
+        </w:rPr>
+        <w:t>Scan anyway</w:t>
+      </w:r>
+      <w:r>
+        <w:rPr>
+          <w:b w:val="0"/>
+        </w:rPr>
+        <w:t>, with the progress and time</w:t>
+      </w:r>
+    </w:p>
+    <w:p>
+      <w:r>
+        <w:rPr>
+          <w:b w:val="0"/>
+        </w:rPr>
+        <w:t xml:space="preserve">  left (*"6 of 10 accounts ready, about 25 minutes to go"*).</w:t>
+      </w:r>
+    </w:p>
+    <w:p>
+      <w:pPr>
+        <w:pStyle w:val="ListBullet"/>
+      </w:pPr>
+      <w:r>
+        <w:rPr>
+          <w:b/>
+        </w:rPr>
+        <w:t>Until 10 accounts are Ready, the LinkedIn loop works only towards Ready:</w:t>
+      </w:r>
+      <w:r>
+        <w:rPr>
+          <w:b w:val="0"/>
+        </w:rPr>
+        <w:t xml:space="preserve"> it picks the accounts with</w:t>
+      </w:r>
+    </w:p>
+    <w:p>
+      <w:r>
+        <w:rPr>
+          <w:b w:val="0"/>
+        </w:rPr>
+        <w:t xml:space="preserve">  the fewest touches to Ready (web research done, a web contact to verify), takes each only as far as</w:t>
+      </w:r>
+    </w:p>
+    <w:p>
+      <w:r>
+        <w:rPr>
+          <w:b w:val="0"/>
+        </w:rPr>
+        <w:t xml:space="preserve">  Ready (company page and one relevant contact with a profile), and postpones what lies above Ready —</w:t>
+      </w:r>
+    </w:p>
+    <w:p>
+      <w:r>
+        <w:rPr>
+          <w:b w:val="0"/>
+        </w:rPr>
+        <w:t xml:space="preserve">  contacts 2–3, the People page for the target, the next discovery wave. Expected: 13–15 accounts</w:t>
+      </w:r>
+    </w:p>
+    <w:p>
+      <w:r>
+        <w:rPr>
+          <w:b w:val="0"/>
+        </w:rPr>
+        <w:t xml:space="preserve">  attempted, about 30–35 touches, </w:t>
+      </w:r>
+      <w:r>
+        <w:rPr>
+          <w:b/>
+        </w:rPr>
+        <w:t>about an hour</w:t>
+      </w:r>
+      <w:r>
+        <w:rPr>
+          <w:b w:val="0"/>
+        </w:rPr>
+        <w:t xml:space="preserve"> (to be measured in build step 4).</w:t>
+      </w:r>
+    </w:p>
+    <w:p>
+      <w:pPr>
+        <w:pStyle w:val="ListBullet"/>
+      </w:pPr>
+      <w:r>
+        <w:rPr>
+          <w:b w:val="0"/>
+        </w:rPr>
+        <w:t>The Finish screen says it: *"Your first 10 accounts will be ready in about an hour; the Scanner opens</w:t>
+      </w:r>
+    </w:p>
+    <w:p>
+      <w:r>
+        <w:rPr>
+          <w:b w:val="0"/>
+        </w:rPr>
+        <w:t xml:space="preserve">  then."*</w:t>
+      </w:r>
+    </w:p>
+    <w:p>
+      <w:pPr>
+        <w:pStyle w:val="ListBullet"/>
+      </w:pPr>
+      <w:r>
+        <w:rPr>
+          <w:b/>
+        </w:rPr>
+        <w:t>The pipeline ceiling stays at 60</w:t>
+      </w:r>
+      <w:r>
+        <w:rPr>
+          <w:b w:val="0"/>
+        </w:rPr>
+        <w:t xml:space="preserve"> of the 99 in any rolling 24 hours. Because the window rolls, day 2</w:t>
+      </w:r>
+    </w:p>
+    <w:p>
+      <w:r>
+        <w:rPr>
+          <w:b w:val="0"/>
+        </w:rPr>
+        <w:t xml:space="preserve">  does not start with a fresh 99: the guarantee is **at least 39 touches for the user's scans at any</w:t>
+      </w:r>
+    </w:p>
+    <w:p>
+      <w:r>
+        <w:rPr>
+          <w:b w:val="0"/>
+        </w:rPr>
+        <w:t xml:space="preserve">  moment**. Build step 4 measures the touches a typical scan of 10–20 accounts needs; if 39 proves too</w:t>
+      </w:r>
+    </w:p>
+    <w:p>
+      <w:r>
+        <w:rPr>
+          <w:b w:val="0"/>
+        </w:rPr>
+        <w:t xml:space="preserve">  few, the answer is a lower pipeline ceiling, never a borrowed one.</w:t>
       </w:r>
     </w:p>
     <w:p>
@@ -7733,7 +8150,7 @@
               <w:rPr>
                 <w:b w:val="0"/>
               </w:rPr>
-              <w:t>LinkedIn after web (7): ranking rule, one profile search + People page</w:t>
+              <w:t>LinkedIn after web (7): ranking rule, one profile search + People page; first 10 Ready first and the Scanner at 10 (7.3, D7)</w:t>
             </w:r>
           </w:p>
         </w:tc>
@@ -7761,7 +8178,7 @@
               <w:rPr>
                 <w:b w:val="0"/>
               </w:rPr>
-              <w:t>touches per account vs. section 9</w:t>
+              <w:t>touches per account vs. section 9; time to 10 Ready; touches per Leads scan (D7)</w:t>
             </w:r>
           </w:p>
         </w:tc>
@@ -7963,7 +8380,15 @@
         <w:rPr>
           <w:b w:val="0"/>
         </w:rPr>
-        <w:t>12. Decisions for Boaz</w:t>
+        <w:t>12. Decisions — all agreed 2026-09-28</w:t>
+      </w:r>
+    </w:p>
+    <w:p>
+      <w:r>
+        <w:rPr>
+          <w:b w:val="0"/>
+        </w:rPr>
+        <w:t>Boaz agreed to every recommendation below.</w:t>
       </w:r>
     </w:p>
     <w:tbl>
@@ -8324,6 +8749,168 @@
                 <w:b w:val="0"/>
               </w:rPr>
               <w:t xml:space="preserve"> — it is small and independent of everything else</w:t>
+            </w:r>
+          </w:p>
+        </w:tc>
+      </w:tr>
+      <w:tr>
+        <w:tc>
+          <w:tcPr>
+            <w:tcW w:type="dxa" w:w="2880"/>
+          </w:tcPr>
+          <w:p>
+            <w:r/>
+            <w:r>
+              <w:rPr>
+                <w:b/>
+              </w:rPr>
+              <w:t>D7</w:t>
+            </w:r>
+          </w:p>
+        </w:tc>
+        <w:tc>
+          <w:tcPr>
+            <w:tcW w:type="dxa" w:w="2880"/>
+          </w:tcPr>
+          <w:p>
+            <w:r/>
+            <w:r>
+              <w:rPr>
+                <w:b w:val="0"/>
+              </w:rPr>
+              <w:t>Raise the pipeline's LinkedIn ceiling (e.g. 60 → 75) after onboarding to build faster?</w:t>
+            </w:r>
+          </w:p>
+        </w:tc>
+        <w:tc>
+          <w:tcPr>
+            <w:tcW w:type="dxa" w:w="2880"/>
+          </w:tcPr>
+          <w:p>
+            <w:r/>
+            <w:r>
+              <w:rPr>
+                <w:b/>
+              </w:rPr>
+              <w:t>No</w:t>
+            </w:r>
+            <w:r>
+              <w:rPr>
+                <w:b w:val="0"/>
+              </w:rPr>
+              <w:t xml:space="preserve"> — the Scanner needs </w:t>
+            </w:r>
+            <w:r>
+              <w:rPr>
+                <w:b/>
+              </w:rPr>
+              <w:t>10 Ready</w:t>
+            </w:r>
+            <w:r>
+              <w:rPr>
+                <w:b w:val="0"/>
+              </w:rPr>
+              <w:t xml:space="preserve"> (was 5, soft gate), and the pipeline goes for the first 10 Ready before anything else (7.3). The ceiling stays 60, guaranteeing at least 39 touches for scans; touches per scan are measured in step 4. Boaz's proposal, 2026-09-28</w:t>
+            </w:r>
+          </w:p>
+        </w:tc>
+      </w:tr>
+      <w:tr>
+        <w:tc>
+          <w:tcPr>
+            <w:tcW w:type="dxa" w:w="2880"/>
+          </w:tcPr>
+          <w:p>
+            <w:r/>
+            <w:r>
+              <w:rPr>
+                <w:b/>
+              </w:rPr>
+              <w:t>D8</w:t>
+            </w:r>
+          </w:p>
+        </w:tc>
+        <w:tc>
+          <w:tcPr>
+            <w:tcW w:type="dxa" w:w="2880"/>
+          </w:tcPr>
+          <w:p>
+            <w:r/>
+            <w:r>
+              <w:rPr>
+                <w:b w:val="0"/>
+              </w:rPr>
+              <w:t>Use touches left under the 60 at night (e.g. 01:00–05:00) for extra LinkedIn work?</w:t>
+            </w:r>
+          </w:p>
+        </w:tc>
+        <w:tc>
+          <w:tcPr>
+            <w:tcW w:type="dxa" w:w="2880"/>
+          </w:tcPr>
+          <w:p>
+            <w:r/>
+            <w:r>
+              <w:rPr>
+                <w:b/>
+              </w:rPr>
+              <w:t>No change.</w:t>
+            </w:r>
+            <w:r>
+              <w:rPr>
+                <w:b w:val="0"/>
+              </w:rPr>
+              <w:t xml:space="preserve"> The pipeline already resumes whenever it is under 60 in the rolling 24 hours, day or night, while Chrome and a SalesTeam page are open. Night adds no capacity (a touch at 03:00 counts until 03:00 next day). Not added: a background timer without a page open, or keeping the computer awake at night (1.2.0 D4 stands; unseen 03:00 activity would contradict "visible in your browser")</w:t>
+            </w:r>
+          </w:p>
+        </w:tc>
+      </w:tr>
+      <w:tr>
+        <w:tc>
+          <w:tcPr>
+            <w:tcW w:type="dxa" w:w="2880"/>
+          </w:tcPr>
+          <w:p>
+            <w:r/>
+            <w:r>
+              <w:rPr>
+                <w:b/>
+              </w:rPr>
+              <w:t>D9</w:t>
+            </w:r>
+          </w:p>
+        </w:tc>
+        <w:tc>
+          <w:tcPr>
+            <w:tcW w:type="dxa" w:w="2880"/>
+          </w:tcPr>
+          <w:p>
+            <w:r/>
+            <w:r>
+              <w:rPr>
+                <w:b w:val="0"/>
+              </w:rPr>
+              <w:t>Discovery for medium or small companies instead of the largest</w:t>
+            </w:r>
+          </w:p>
+        </w:tc>
+        <w:tc>
+          <w:tcPr>
+            <w:tcW w:type="dxa" w:w="2880"/>
+          </w:tcPr>
+          <w:p>
+            <w:r/>
+            <w:r>
+              <w:rPr>
+                <w:b/>
+              </w:rPr>
+              <w:t>Size-band listings, the target split by band priority, centre of each band first</w:t>
+            </w:r>
+            <w:r>
+              <w:rPr>
+                <w:b w:val="0"/>
+              </w:rPr>
+              <w:t xml:space="preserve"> (4.3). Bands stay the wizard's S/M/L/XL/XXL, shown with their ranges on the Size step. Boaz's proposal, adapted 2026-09-28</w:t>
             </w:r>
           </w:p>
         </w:tc>

</xml_diff>

<commit_message>
1.2.1 step 1 (1.2.0.4): per-field web sources, Usable without LinkedIn, "Web" rows, exclusions by name/website
- web-research-apply.js reads the per-field {value, url} answer format and the old plain one;
  webCitationFor cites a value only with a url of its own (old researches keep the old rule)
- provenance stamping, the confirm pass and deriveProvenance use the per-field verdict
- readiness.js: webUsable + usableVia; Target Accounts shows "not yet on LinkedIn" and a "web only" tag
- new pure company-identity.js: normalizeCompanyName (moved), websiteDomain, webCompanyId, exclusion matcher
- exclusions match slug, name or domain; the wizard keeps name/domain entries on save
- 41 new checks in test_pure_modules.py (318 pass)

Co-Authored-By: Claude Opus 5.5 <noreply@anthropic.com>
</commit_message>
<xml_diff>
--- a/ONBOARDING_RESEARCH_DESIGN.docx
+++ b/ONBOARDING_RESEARCH_DESIGN.docx
@@ -8640,6 +8640,334 @@
       </w:tr>
     </w:tbl>
     <w:p/>
+    <w:p>
+      <w:r>
+        <w:rPr>
+          <w:b/>
+        </w:rPr>
+        <w:t>As built (step 1, 1.2.0.4):</w:t>
+      </w:r>
+      <w:r>
+        <w:rPr>
+          <w:b w:val="0"/>
+        </w:rPr>
+        <w:t xml:space="preserve"> a new pure module, </w:t>
+      </w:r>
+      <w:r>
+        <w:rPr>
+          <w:rFonts w:ascii="Consolas" w:hAnsi="Consolas"/>
+          <w:b w:val="0"/>
+        </w:rPr>
+        <w:t>company-identity.js</w:t>
+      </w:r>
+      <w:r>
+        <w:rPr>
+          <w:b w:val="0"/>
+        </w:rPr>
+        <w:t xml:space="preserve">, holds </w:t>
+      </w:r>
+      <w:r>
+        <w:rPr>
+          <w:rFonts w:ascii="Consolas" w:hAnsi="Consolas"/>
+          <w:b w:val="0"/>
+        </w:rPr>
+        <w:t>normalizeCompanyName</w:t>
+      </w:r>
+    </w:p>
+    <w:p>
+      <w:r>
+        <w:rPr>
+          <w:b w:val="0"/>
+        </w:rPr>
+        <w:t xml:space="preserve">(moved out of </w:t>
+      </w:r>
+      <w:r>
+        <w:rPr>
+          <w:rFonts w:ascii="Consolas" w:hAnsi="Consolas"/>
+          <w:b w:val="0"/>
+        </w:rPr>
+        <w:t>storage.js</w:t>
+      </w:r>
+      <w:r>
+        <w:rPr>
+          <w:b w:val="0"/>
+        </w:rPr>
+        <w:t xml:space="preserve">, which re-exports it), </w:t>
+      </w:r>
+      <w:r>
+        <w:rPr>
+          <w:rFonts w:ascii="Consolas" w:hAnsi="Consolas"/>
+          <w:b w:val="0"/>
+        </w:rPr>
+        <w:t>websiteDomain</w:t>
+      </w:r>
+      <w:r>
+        <w:rPr>
+          <w:b w:val="0"/>
+        </w:rPr>
+        <w:t xml:space="preserve">, </w:t>
+      </w:r>
+      <w:r>
+        <w:rPr>
+          <w:rFonts w:ascii="Consolas" w:hAnsi="Consolas"/>
+          <w:b w:val="0"/>
+        </w:rPr>
+        <w:t>webCompanyId</w:t>
+      </w:r>
+      <w:r>
+        <w:rPr>
+          <w:b w:val="0"/>
+        </w:rPr>
+        <w:t xml:space="preserve"> ("W-&lt;domain&gt;" or</w:t>
+      </w:r>
+    </w:p>
+    <w:p>
+      <w:r>
+        <w:rPr>
+          <w:b w:val="0"/>
+        </w:rPr>
+        <w:t xml:space="preserve">"W-&lt;normalised name&gt;") and the exclusion matcher: </w:t>
+      </w:r>
+      <w:r>
+        <w:rPr>
+          <w:rFonts w:ascii="Consolas" w:hAnsi="Consolas"/>
+          <w:b w:val="0"/>
+        </w:rPr>
+        <w:t>isCompanyRowExcluded</w:t>
+      </w:r>
+      <w:r>
+        <w:rPr>
+          <w:b w:val="0"/>
+        </w:rPr>
+        <w:t xml:space="preserve"> now takes</w:t>
+      </w:r>
+    </w:p>
+    <w:p>
+      <w:r>
+        <w:rPr>
+          <w:rFonts w:ascii="Consolas" w:hAnsi="Consolas"/>
+          <w:b w:val="0"/>
+        </w:rPr>
+        <w:t>buildExclusionMatcher(exclusions)</w:t>
+      </w:r>
+      <w:r>
+        <w:rPr>
+          <w:b w:val="0"/>
+        </w:rPr>
+        <w:t xml:space="preserve"> and matches slug, name or domain (Discovery's card check too). The</w:t>
+      </w:r>
+    </w:p>
+    <w:p>
+      <w:r>
+        <w:rPr>
+          <w:b w:val="0"/>
+        </w:rPr>
+        <w:t>wizard's Exclusions step shows LinkedIn pages only, so it carries name/domain entries through a save</w:t>
+      </w:r>
+    </w:p>
+    <w:p>
+      <w:r>
+        <w:rPr>
+          <w:b w:val="0"/>
+        </w:rPr>
+        <w:t xml:space="preserve">untouched. </w:t>
+      </w:r>
+      <w:r>
+        <w:rPr>
+          <w:rFonts w:ascii="Consolas" w:hAnsi="Consolas"/>
+          <w:b w:val="0"/>
+        </w:rPr>
+        <w:t>web-research-apply.js</w:t>
+      </w:r>
+      <w:r>
+        <w:rPr>
+          <w:b w:val="0"/>
+        </w:rPr>
+        <w:t xml:space="preserve"> reads both answer formats (</w:t>
+      </w:r>
+      <w:r>
+        <w:rPr>
+          <w:rFonts w:ascii="Consolas" w:hAnsi="Consolas"/>
+          <w:b w:val="0"/>
+        </w:rPr>
+        <w:t>findingValue</w:t>
+      </w:r>
+      <w:r>
+        <w:rPr>
+          <w:b w:val="0"/>
+        </w:rPr>
+        <w:t xml:space="preserve">, </w:t>
+      </w:r>
+      <w:r>
+        <w:rPr>
+          <w:rFonts w:ascii="Consolas" w:hAnsi="Consolas"/>
+          <w:b w:val="0"/>
+        </w:rPr>
+        <w:t>findingUrl</w:t>
+      </w:r>
+      <w:r>
+        <w:rPr>
+          <w:b w:val="0"/>
+        </w:rPr>
+        <w:t>) and decides</w:t>
+      </w:r>
+    </w:p>
+    <w:p>
+      <w:r>
+        <w:rPr>
+          <w:b w:val="0"/>
+        </w:rPr>
+        <w:t xml:space="preserve">per field with </w:t>
+      </w:r>
+      <w:r>
+        <w:rPr>
+          <w:rFonts w:ascii="Consolas" w:hAnsi="Consolas"/>
+          <w:b w:val="0"/>
+        </w:rPr>
+        <w:t>webCitationFor</w:t>
+      </w:r>
+      <w:r>
+        <w:rPr>
+          <w:b w:val="0"/>
+        </w:rPr>
+        <w:t>: a value is cited only with a url of its own, and only when it agrees</w:t>
+      </w:r>
+    </w:p>
+    <w:p>
+      <w:r>
+        <w:rPr>
+          <w:b w:val="0"/>
+        </w:rPr>
+        <w:t>with the value in place; a research stored before 1.2.1 keeps the old rule. Every place that stamped</w:t>
+      </w:r>
+    </w:p>
+    <w:p>
+      <w:r>
+        <w:rPr>
+          <w:rFonts w:ascii="Consolas" w:hAnsi="Consolas"/>
+          <w:b w:val="0"/>
+        </w:rPr>
+        <w:t>cited</w:t>
+      </w:r>
+      <w:r>
+        <w:rPr>
+          <w:b w:val="0"/>
+        </w:rPr>
+        <w:t xml:space="preserve"> from the research's whole source list now uses it (override stamping, the confirm pass,</w:t>
+      </w:r>
+    </w:p>
+    <w:p>
+      <w:r>
+        <w:rPr>
+          <w:rFonts w:ascii="Consolas" w:hAnsi="Consolas"/>
+          <w:b w:val="0"/>
+        </w:rPr>
+        <w:t>deriveProvenance</w:t>
+      </w:r>
+      <w:r>
+        <w:rPr>
+          <w:b w:val="0"/>
+        </w:rPr>
+        <w:t xml:space="preserve"> via </w:t>
+      </w:r>
+      <w:r>
+        <w:rPr>
+          <w:rFonts w:ascii="Consolas" w:hAnsi="Consolas"/>
+          <w:b w:val="0"/>
+        </w:rPr>
+        <w:t>facts.webCitations</w:t>
+      </w:r>
+      <w:r>
+        <w:rPr>
+          <w:b w:val="0"/>
+        </w:rPr>
+        <w:t xml:space="preserve">). For </w:t>
+      </w:r>
+      <w:r>
+        <w:rPr>
+          <w:rFonts w:ascii="Consolas" w:hAnsi="Consolas"/>
+          <w:b w:val="0"/>
+        </w:rPr>
+        <w:t>webUsable</w:t>
+      </w:r>
+      <w:r>
+        <w:rPr>
+          <w:b w:val="0"/>
+        </w:rPr>
+        <w:t>, the identity test is a website (with or</w:t>
+      </w:r>
+    </w:p>
+    <w:p>
+      <w:r>
+        <w:rPr>
+          <w:b w:val="0"/>
+        </w:rPr>
+        <w:t xml:space="preserve">without </w:t>
+      </w:r>
+      <w:r>
+        <w:rPr>
+          <w:rFonts w:ascii="Consolas" w:hAnsi="Consolas"/>
+          <w:b w:val="0"/>
+        </w:rPr>
+        <w:t>https://</w:t>
+      </w:r>
+      <w:r>
+        <w:rPr>
+          <w:b w:val="0"/>
+        </w:rPr>
+        <w:t xml:space="preserve">) or an </w:t>
+      </w:r>
+      <w:r>
+        <w:rPr>
+          <w:rFonts w:ascii="Consolas" w:hAnsi="Consolas"/>
+          <w:b w:val="0"/>
+        </w:rPr>
+        <w:t>http(s)</w:t>
+      </w:r>
+      <w:r>
+        <w:rPr>
+          <w:b w:val="0"/>
+        </w:rPr>
+        <w:t xml:space="preserve"> primary source url; a website comes from the row, an edit, or a</w:t>
+      </w:r>
+    </w:p>
+    <w:p>
+      <w:r>
+        <w:rPr>
+          <w:b w:val="0"/>
+        </w:rPr>
+        <w:t>research that cited it. Measured on the 2026-09-29 backup: of 551 live accounts, 11 are not scannable</w:t>
+      </w:r>
+    </w:p>
+    <w:p>
+      <w:r>
+        <w:rPr>
+          <w:b w:val="0"/>
+        </w:rPr>
+        <w:t>and one of them (Swiss Air-Rescue Rega, P3) becomes Usable via the web; nothing else changes, and every</w:t>
+      </w:r>
+    </w:p>
+    <w:p>
+      <w:r>
+        <w:rPr>
+          <w:b w:val="0"/>
+        </w:rPr>
+        <w:t xml:space="preserve">stored research is in the old format, so no provenance changes. </w:t>
+      </w:r>
+      <w:r>
+        <w:rPr>
+          <w:rFonts w:ascii="Consolas" w:hAnsi="Consolas"/>
+          <w:b w:val="0"/>
+        </w:rPr>
+        <w:t>MIN_READY_TO_SCAN</w:t>
+      </w:r>
+      <w:r>
+        <w:rPr>
+          <w:b w:val="0"/>
+        </w:rPr>
+        <w:t xml:space="preserve"> stays 5 until step 4.</w:t>
+      </w:r>
+    </w:p>
     <w:p>
       <w:pPr>
         <w:pStyle w:val="Heading2"/>

</xml_diff>

<commit_message>
1.2.0.4: removing a company from the exclusion list now includes it again; edited accounts are tried first
- companyExclusionsLifted: a slug taken off the list overrides the research workbook's Excluded flag and
  is not re-added by the import's backfill (SOPHiA GENETICS, CKW etc. could not be included before)
- userRetryFirst: an account given an Alt. name or LinkedIn link jumps the pipeline queue until tried once
  ("Swiss Air-Rescue Rega" -> "Rega", P3, had waited behind every P1/P2 account)

Co-Authored-By: Claude Opus 5.5 <noreply@anthropic.com>
</commit_message>
<xml_diff>
--- a/ONBOARDING_RESEARCH_DESIGN.docx
+++ b/ONBOARDING_RESEARCH_DESIGN.docx
@@ -8966,6 +8966,72 @@
           <w:b w:val="0"/>
         </w:rPr>
         <w:t xml:space="preserve"> stays 5 until step 4.</w:t>
+      </w:r>
+    </w:p>
+    <w:p>
+      <w:r>
+        <w:rPr>
+          <w:b w:val="0"/>
+        </w:rPr>
+        <w:t>Two fixes in the same build, from Boaz's check of those numbers: a slug taken off the exclusion list in</w:t>
+      </w:r>
+    </w:p>
+    <w:p>
+      <w:r>
+        <w:rPr>
+          <w:b w:val="0"/>
+        </w:rPr>
+        <w:t xml:space="preserve">the wizard is kept in </w:t>
+      </w:r>
+      <w:r>
+        <w:rPr>
+          <w:rFonts w:ascii="Consolas" w:hAnsi="Consolas"/>
+          <w:b w:val="0"/>
+        </w:rPr>
+        <w:t>companyExclusionsLifted</w:t>
+      </w:r>
+      <w:r>
+        <w:rPr>
+          <w:b w:val="0"/>
+        </w:rPr>
+        <w:t xml:space="preserve"> and overrides the research workbook's own Excluded flag</w:t>
+      </w:r>
+    </w:p>
+    <w:p>
+      <w:r>
+        <w:rPr>
+          <w:b w:val="0"/>
+        </w:rPr>
+        <w:t>(before, the ten companies its Exclusion_List marks "Competitor" could not be included again, and the</w:t>
+      </w:r>
+    </w:p>
+    <w:p>
+      <w:r>
+        <w:rPr>
+          <w:b w:val="0"/>
+        </w:rPr>
+        <w:t>import's backfill put them back); and an account the user gave an Alt. name or LinkedIn link is taken</w:t>
+      </w:r>
+    </w:p>
+    <w:p>
+      <w:r>
+        <w:rPr>
+          <w:b w:val="0"/>
+        </w:rPr>
+        <w:t>first by the pipeline until it has been tried once with it (</w:t>
+      </w:r>
+      <w:r>
+        <w:rPr>
+          <w:rFonts w:ascii="Consolas" w:hAnsi="Consolas"/>
+          <w:b w:val="0"/>
+        </w:rPr>
+        <w:t>userRetryFirst</w:t>
+      </w:r>
+      <w:r>
+        <w:rPr>
+          <w:b w:val="0"/>
+        </w:rPr>
+        <w:t>, pipeline-plan.js).</w:t>
       </w:r>
     </w:p>
     <w:p>

</xml_diff>

<commit_message>
1.2.0.7: LinkedIn profile search from web search results (D10), per-account Activity Log lines, last-run details
- searchLinkedinProfiles (Haiku, max 2 searches); profilesFromSearchResults decides: name AND company in the
  result title, exactly one profile (pure, tested); up to 6 people per account, new and known contacts
- missingWebTopics gains 'profiles'; 30-day skip per part (main research / profile search)
- one Activity Log line per account; dialog shows the last run account by account
- first measurement recorded in the design doc: ~US$0.09/private account, 2 of 42 profiles, ~204 s/private account

Co-Authored-By: Claude Opus 5.5 <noreply@anthropic.com>
</commit_message>
<xml_diff>
--- a/ONBOARDING_RESEARCH_DESIGN.docx
+++ b/ONBOARDING_RESEARCH_DESIGN.docx
@@ -9362,6 +9362,231 @@
           <w:b w:val="0"/>
         </w:rPr>
         <w:t>per-use fee: the pages read are billed as input tokens, which the measurement includes.</w:t>
+      </w:r>
+    </w:p>
+    <w:p>
+      <w:r>
+        <w:rPr>
+          <w:b/>
+        </w:rPr>
+        <w:t>First measurement (1.2.0.6, 2026-09-29/30, 24 real accounts):</w:t>
+      </w:r>
+      <w:r>
+        <w:rPr>
+          <w:b w:val="0"/>
+        </w:rPr>
+        <w:t xml:space="preserve"> about US$0.09 per private company and US$0.19</w:t>
+      </w:r>
+    </w:p>
+    <w:p>
+      <w:r>
+        <w:rPr>
+          <w:b w:val="0"/>
+        </w:rPr>
+        <w:t>for the one publicly traded company (below the design's estimate); 42 named people added from the web; but only</w:t>
+      </w:r>
+    </w:p>
+    <w:p>
+      <w:r>
+        <w:rPr>
+          <w:b/>
+        </w:rPr>
+        <w:t>2 of 42</w:t>
+      </w:r>
+      <w:r>
+        <w:rPr>
+          <w:b w:val="0"/>
+        </w:rPr>
+        <w:t xml:space="preserve"> came with a LinkedIn profile link, and private companies took </w:t>
+      </w:r>
+      <w:r>
+        <w:rPr>
+          <w:b/>
+        </w:rPr>
+        <w:t>about 204 s each</w:t>
+      </w:r>
+      <w:r>
+        <w:rPr>
+          <w:b w:val="0"/>
+        </w:rPr>
+        <w:t xml:space="preserve"> (the traded one</w:t>
+      </w:r>
+    </w:p>
+    <w:p>
+      <w:r>
+        <w:rPr>
+          <w:b w:val="0"/>
+        </w:rPr>
+        <w:t>20 s), close to the 4-minute cut-off. The second run stopped at 19 of 20 on the user's own Anthropic Console</w:t>
+      </w:r>
+    </w:p>
+    <w:p>
+      <w:r>
+        <w:rPr>
+          <w:b w:val="0"/>
+        </w:rPr>
+        <w:t xml:space="preserve">monthly limit (not a fault). </w:t>
+      </w:r>
+      <w:r>
+        <w:rPr>
+          <w:b/>
+        </w:rPr>
+        <w:t>1.2.0.7:</w:t>
+      </w:r>
+      <w:r>
+        <w:rPr>
+          <w:b w:val="0"/>
+        </w:rPr>
+        <w:t xml:space="preserve"> a separate </w:t>
+      </w:r>
+      <w:r>
+        <w:rPr>
+          <w:b/>
+        </w:rPr>
+        <w:t>profile search</w:t>
+      </w:r>
+      <w:r>
+        <w:rPr>
+          <w:b w:val="0"/>
+        </w:rPr>
+        <w:t xml:space="preserve"> after each research (Haiku 4.5, at most 2</w:t>
+      </w:r>
+    </w:p>
+    <w:p>
+      <w:r>
+        <w:rPr>
+          <w:b w:val="0"/>
+        </w:rPr>
+        <w:t xml:space="preserve">web searches, about US$0.01-0.02): the model only runs </w:t>
+      </w:r>
+      <w:r>
+        <w:rPr>
+          <w:rFonts w:ascii="Consolas" w:hAnsi="Consolas"/>
+          <w:b w:val="0"/>
+        </w:rPr>
+        <w:t>site:linkedin.com/in "&lt;company&gt;" "&lt;name&gt;" OR ...</w:t>
+      </w:r>
+      <w:r>
+        <w:rPr>
+          <w:b w:val="0"/>
+        </w:rPr>
+        <w:t>, and code</w:t>
+      </w:r>
+    </w:p>
+    <w:p>
+      <w:r>
+        <w:rPr>
+          <w:b w:val="0"/>
+        </w:rPr>
+        <w:t>decides (</w:t>
+      </w:r>
+      <w:r>
+        <w:rPr>
+          <w:rFonts w:ascii="Consolas" w:hAnsi="Consolas"/>
+          <w:b w:val="0"/>
+        </w:rPr>
+        <w:t>profilesFromSearchResults</w:t>
+      </w:r>
+      <w:r>
+        <w:rPr>
+          <w:b w:val="0"/>
+        </w:rPr>
+        <w:t>, pipeline-plan.js): a result counts only when its title names the person</w:t>
+      </w:r>
+    </w:p>
+    <w:p>
+      <w:r>
+        <w:rPr>
+          <w:b w:val="0"/>
+        </w:rPr>
+        <w:t>(first and last name, umlauts and titles folded) AND a distinctive word of the company, and exactly one profile</w:t>
+      </w:r>
+    </w:p>
+    <w:p>
+      <w:r>
+        <w:rPr>
+          <w:b w:val="0"/>
+        </w:rPr>
+        <w:t>matches. It covers up to 6 people per account without a profile - new web contacts and those already known</w:t>
+      </w:r>
+    </w:p>
+    <w:p>
+      <w:r>
+        <w:rPr>
+          <w:b w:val="0"/>
+        </w:rPr>
+        <w:t xml:space="preserve">(343 accounts on the backup have some) - so </w:t>
+      </w:r>
+      <w:r>
+        <w:rPr>
+          <w:rFonts w:ascii="Consolas" w:hAnsi="Consolas"/>
+          <w:b w:val="0"/>
+        </w:rPr>
+        <w:t>missingWebTopics</w:t>
+      </w:r>
+      <w:r>
+        <w:rPr>
+          <w:b w:val="0"/>
+        </w:rPr>
+        <w:t xml:space="preserve"> gains a </w:t>
+      </w:r>
+      <w:r>
+        <w:rPr>
+          <w:rFonts w:ascii="Consolas" w:hAnsi="Consolas"/>
+          <w:b w:val="0"/>
+        </w:rPr>
+        <w:t>profiles</w:t>
+      </w:r>
+      <w:r>
+        <w:rPr>
+          <w:b w:val="0"/>
+        </w:rPr>
+        <w:t xml:space="preserve"> topic; an account missing only</w:t>
+      </w:r>
+    </w:p>
+    <w:p>
+      <w:r>
+        <w:rPr>
+          <w:b w:val="0"/>
+        </w:rPr>
+        <w:t>profiles gets only the profile search. The 30-day skip now applies to the main research and the profile search</w:t>
+      </w:r>
+    </w:p>
+    <w:p>
+      <w:r>
+        <w:rPr>
+          <w:b w:val="0"/>
+        </w:rPr>
+        <w:t>separately (</w:t>
+      </w:r>
+      <w:r>
+        <w:rPr>
+          <w:rFonts w:ascii="Consolas" w:hAnsi="Consolas"/>
+          <w:b w:val="0"/>
+        </w:rPr>
+        <w:t>webProfileSearchAt</w:t>
+      </w:r>
+      <w:r>
+        <w:rPr>
+          <w:b w:val="0"/>
+        </w:rPr>
+        <w:t>). Every account writes one Activity Log line (time, cost, searches, pages read,</w:t>
+      </w:r>
+    </w:p>
+    <w:p>
+      <w:r>
+        <w:rPr>
+          <w:b w:val="0"/>
+        </w:rPr>
+        <w:t>rounds, cut off, profiles found), and the dialog shows the last run account by account, to find the cause of the</w:t>
+      </w:r>
+    </w:p>
+    <w:p>
+      <w:r>
+        <w:rPr>
+          <w:b w:val="0"/>
+        </w:rPr>
+        <w:t>slow private-company researches before changing anything there.</w:t>
       </w:r>
     </w:p>
     <w:p>

</xml_diff>

<commit_message>
Design: step 2 measured on 1.2.0.7 (no hangs, ~US$0.10/account, 38 of 104 profiles from the web)
Co-Authored-By: Claude Opus 5.5 <noreply@anthropic.com>
</commit_message>
<xml_diff>
--- a/ONBOARDING_RESEARCH_DESIGN.docx
+++ b/ONBOARDING_RESEARCH_DESIGN.docx
@@ -9587,6 +9587,106 @@
           <w:b w:val="0"/>
         </w:rPr>
         <w:t>slow private-company researches before changing anything there.</w:t>
+      </w:r>
+    </w:p>
+    <w:p>
+      <w:r>
+        <w:rPr>
+          <w:b w:val="0"/>
+        </w:rPr>
+        <w:t xml:space="preserve">The list showed the cause: 13 of 20 researches </w:t>
+      </w:r>
+      <w:r>
+        <w:rPr>
+          <w:b/>
+        </w:rPr>
+        <w:t>hung</w:t>
+      </w:r>
+      <w:r>
+        <w:rPr>
+          <w:b w:val="0"/>
+        </w:rPr>
+        <w:t xml:space="preserve"> until the cut-off (about US$0.037, nothing found) on the</w:t>
+      </w:r>
+    </w:p>
+    <w:p>
+      <w:r>
+        <w:rPr>
+          <w:b w:val="0"/>
+        </w:rPr>
+        <w:t>dynamic-filtering tool versions (20260209), while the rest finished in about 20 s; the lane now uses the basic</w:t>
+      </w:r>
+    </w:p>
+    <w:p>
+      <w:r>
+        <w:rPr>
+          <w:b w:val="0"/>
+        </w:rPr>
+        <w:t xml:space="preserve">versions first. </w:t>
+      </w:r>
+      <w:r>
+        <w:rPr>
+          <w:b/>
+        </w:rPr>
+        <w:t>Second measurement (1.2.0.7, 2026-09-30, 20 accounts): no hangs</w:t>
+      </w:r>
+      <w:r>
+        <w:rPr>
+          <w:b w:val="0"/>
+        </w:rPr>
+        <w:t>, US$1.98 in all - publicly</w:t>
+      </w:r>
+    </w:p>
+    <w:p>
+      <w:r>
+        <w:rPr>
+          <w:b w:val="0"/>
+        </w:rPr>
+        <w:t>traded (9): about US$0.135 and 26 s each, 66 contacts added; the rest (11, mostly a profile search only): about</w:t>
+      </w:r>
+    </w:p>
+    <w:p>
+      <w:r>
+        <w:rPr>
+          <w:b w:val="0"/>
+        </w:rPr>
+        <w:t xml:space="preserve">US$0.070 and 9 s each. Profile search: </w:t>
+      </w:r>
+      <w:r>
+        <w:rPr>
+          <w:b/>
+        </w:rPr>
+        <w:t>38 of 104 people</w:t>
+      </w:r>
+      <w:r>
+        <w:rPr>
+          <w:b w:val="0"/>
+        </w:rPr>
+        <w:t xml:space="preserve"> found on LinkedIn from search results (was 2 of 42),</w:t>
+      </w:r>
+    </w:p>
+    <w:p>
+      <w:r>
+        <w:rPr>
+          <w:b w:val="0"/>
+        </w:rPr>
+        <w:t>and Ready went from 136 to 144 without a LinkedIn visit. Planning figures for 9 and step 4: about US$0.10 per</w:t>
+      </w:r>
+    </w:p>
+    <w:p>
+      <w:r>
+        <w:rPr>
+          <w:b w:val="0"/>
+        </w:rPr>
+        <w:t>account for the web lane with profiles, and about a third of the people get their profile from the web - the rest</w:t>
+      </w:r>
+    </w:p>
+    <w:p>
+      <w:r>
+        <w:rPr>
+          <w:b w:val="0"/>
+        </w:rPr>
+        <w:t>still need one LinkedIn search each.</w:t>
       </w:r>
     </w:p>
     <w:p>

</xml_diff>

<commit_message>
1.2.0.8: Find new accounts - the web first, LinkedIn optional (D11 revised: LinkedIn's free company search does not hold its location filter; kept as an option for local branches of international groups)
Co-Authored-By: Claude Opus 5.5 <noreply@anthropic.com>
</commit_message>
<xml_diff>
--- a/ONBOARDING_RESEARCH_DESIGN.docx
+++ b/ONBOARDING_RESEARCH_DESIGN.docx
@@ -4582,13 +4582,13 @@
         <w:rPr>
           <w:b/>
         </w:rPr>
-        <w:t xml:space="preserve">Revised 2026-09-30 (D11): LinkedIn first, the web as the complement. </w:t>
-      </w:r>
-      <w:r>
-        <w:rPr>
-          <w:b w:val="0"/>
-        </w:rPr>
-        <w:t>Onboarding finds new accounts with the existing LinkedIn company search first - one search per ticked size band, each asked for its band's share of the target - and uses the web listings below only for what LinkedIn did not deliver: the rest of the target, countries without a confirmed LinkedIn id, or everything when LinkedIn cannot be used (daily limit, busy). Sections 4.1-4.4 describe that web part; the LinkedIn part is in “As built (step 3)” in section 11.</w:t>
+        <w:t xml:space="preserve">D11, 2026-09-30: the web first, LinkedIn optional. </w:t>
+      </w:r>
+      <w:r>
+        <w:rPr>
+          <w:b w:val="0"/>
+        </w:rPr>
+        <w:t>Web listings (sections 4.1-4.4) find the accounts. The LinkedIn company search is an option, off by default, for about a fifth of the target: it finds mostly local branches of international groups, which listings tend to miss. It was tried first the same day (“LinkedIn first”) and dropped as the main source: LinkedIn’s free company search does not hold its location filter, so it needs the country name as a keyword and then returns mostly companies with the country in their name. Details in “As built (step 3)”, section 11.</w:t>
       </w:r>
     </w:p>
     <w:p>
@@ -8364,12 +8364,10 @@
           </w:tcPr>
           <w:p>
             <w:r>
-              <w:t>Account discovery, LinkedIn first (D11), then web listings; Advanced &gt; Find new accounts (new)</w:t>
-            </w:r>
-            <w:r>
               <w:rPr>
                 <w:b w:val="0"/>
               </w:rPr>
+              <w:t>Account discovery from web listings; optional LinkedIn search for local branches (D11); Advanced &gt; Find new accounts (new)</w:t>
             </w:r>
           </w:p>
         </w:tc>
@@ -8379,12 +8377,10 @@
           </w:tcPr>
           <w:p>
             <w:r>
-              <w:t>new accounts appear as “Discovered” (LinkedIn) and “Web”</w:t>
-            </w:r>
-            <w:r>
               <w:rPr>
                 <w:b w:val="0"/>
               </w:rPr>
+              <w:t>new accounts appear as “Web” (and “Discovered” from LinkedIn)</w:t>
             </w:r>
           </w:p>
         </w:tc>
@@ -8394,23 +8390,16 @@
           </w:tcPr>
           <w:p>
             <w:r>
-              <w:t>measure</w:t>
-            </w:r>
-            <w:r>
               <w:rPr>
                 <w:b/>
               </w:rPr>
+              <w:t>measure</w:t>
             </w:r>
             <w:r>
               <w:rPr>
                 <w:b w:val="0"/>
               </w:rPr>
-            </w:r>
-            <w:r>
-              <w:rPr>
-                <w:b w:val="0"/>
-              </w:rPr>
-              <w:t xml:space="preserve"> LinkedIn pages and visits per account found; web cost per listing, rows kept after filtering, share of web accounts found on LinkedIn</w:t>
+              <w:t xml:space="preserve"> web cost per listing, rows kept after filtering, share of web accounts found on LinkedIn</w:t>
             </w:r>
           </w:p>
         </w:tc>
@@ -9716,13 +9705,13 @@
         <w:rPr>
           <w:b/>
         </w:rPr>
-        <w:t xml:space="preserve">As built (step 3, 1.2.0.8) - LinkedIn first (D11). </w:t>
-      </w:r>
-      <w:r>
-        <w:rPr>
-          <w:b w:val="0"/>
-        </w:rPr>
-        <w:t>Advanced tools &gt; Find new accounts (new)… (all four pages) asks for a target (default 10), a web cost cap, and whether to search LinkedIn first. web-discovery.js (background):</w:t>
+        <w:t xml:space="preserve">As built (step 3, 1.2.0.8) - the web first, LinkedIn optional (D11). </w:t>
+      </w:r>
+      <w:r>
+        <w:rPr>
+          <w:b w:val="0"/>
+        </w:rPr>
+        <w:t>Advanced tools &gt; Find new accounts (new)… (all four pages) asks for a target (default 10), a web cost cap, and whether to also search LinkedIn. web-discovery.js (background):</w:t>
       </w:r>
     </w:p>
     <w:p>
@@ -9733,13 +9722,13 @@
         <w:rPr>
           <w:b/>
         </w:rPr>
-        <w:t xml:space="preserve">LinkedIn. </w:t>
-      </w:r>
-      <w:r>
-        <w:rPr>
-          <w:b w:val="0"/>
-        </w:rPr>
-        <w:t>The automatic pipeline is asked to step aside (as for any job of the user's); then, under one batch lock, the existing company Discovery (company-discovery-extraction.js) runs once per ticked size band with that band's share of target x 1.15 (bandTargets: split by band priority, largest remainder). It keeps its proven rules: the country name as a keyword (a facet-only search leads with Microsoft, Google, Meta - confirmed live 2026-09-15 and again by Boaz on 2026-09-30), headquarters confirmed in a target country, exclusions, aliases, accounts already held. The results merge the usual way (autoMergeDiscoveryResults; a name-only match waits in the decision queue); only the company part is used - contacts stay the pipeline's job. Cost: no money; about one result page per 10 companies plus one company-page visit for each card without an id or location (about 40% in the 2026-09-15 test) - a visit that also does the account's LinkedIn lookup, which a web-found account needs later.</w:t>
+        <w:t xml:space="preserve">The web </w:t>
+      </w:r>
+      <w:r>
+        <w:rPr>
+          <w:b w:val="0"/>
+        </w:rPr>
+        <w:t>finds the accounts: up to five listing pages per country found with web_search, each read with web_fetch (30,000 tokens a page, a second page if the list continues); rows filtered by discovery-filter.js (pure, tested): seller, exclusions, removed, existing, listed twice, then size band, industry (the call maps a stated industry onto the wizard’s names; only a clear “none” drops the row) and excluded organisation types. When the listings run short, the fit search. chooseDiscoveryRows: included companies first, then per band (bandTargets: target x 1.15 split by band priority) by pre-score, centre of the band, listing rank; rows without a headcount last. Added as “Web” rows (addWebDiscoveredCompanies, under the write lock); the pipeline looks each up on LinkedIn later.</w:t>
       </w:r>
     </w:p>
     <w:p>
@@ -9750,21 +9739,35 @@
         <w:rPr>
           <w:b/>
         </w:rPr>
-        <w:t xml:space="preserve">The web, </w:t>
-      </w:r>
-      <w:r>
-        <w:rPr>
-          <w:b w:val="0"/>
-        </w:rPr>
-        <w:t>only for the remainder (and at least their share for countries without a confirmed LinkedIn id): up to five listing pages per country found with web_search, each read with web_fetch (30,000 tokens a page, a second page if the list continues); rows filtered by discovery-filter.js (pure, tested): seller, exclusions, removed, existing, listed twice, then size band, industry (the call maps a stated industry onto the wizard's names; only a clear “none” drops the row) and excluded organisation types. When the listings run short, the fit search. chooseDiscoveryRows: included companies first, then per band by pre-score, centre of the band, listing rank; rows without a headcount last. Added as “Web” rows (addWebDiscoveredCompanies, under the write lock).</w:t>
-      </w:r>
-    </w:p>
-    <w:p>
-      <w:r>
-        <w:rPr>
-          <w:b w:val="0"/>
-        </w:rPr>
-        <w:t>Every added account is scored at once (rescoreDerivedPriorities). One undo for the whole run (Remove the accounts the last run added, a soft delete). The dialog's last-run details list each LinkedIn band and each listing, and how many of the added accounts the LinkedIn work has found since. Not yet measured: waiting for Boaz's run on 10.</w:t>
+        <w:t xml:space="preserve">LinkedIn, only when ticked, </w:t>
+      </w:r>
+      <w:r>
+        <w:rPr>
+          <w:b w:val="0"/>
+        </w:rPr>
+        <w:t>for about a fifth of the target plus what the web fell short of: the automatic pipeline steps aside; under one batch lock the existing company Discovery (company-discovery-extraction.js) runs once per size band, in a small unfocused window (as the pipeline’s), with the country name as keyword and headquarters confirmed in a target country; merged via autoMergeDiscoveryResults (a name-only match waits in the decision queue).</w:t>
+      </w:r>
+    </w:p>
+    <w:p>
+      <w:r>
+        <w:rPr>
+          <w:b/>
+        </w:rPr>
+        <w:t xml:space="preserve">Why LinkedIn is not the main source (2026-09-30). </w:t>
+      </w:r>
+      <w:r>
+        <w:rPr>
+          <w:b w:val="0"/>
+        </w:rPr>
+        <w:t>A first run with LinkedIn first added 12 accounts from 5 result pages at no cost - but nearly all had the country in their name (Huawei Switzerland, Audi Switzerland, Škoda Switzerland…): LinkedIn’s free company search does not hold its location filter (with Switzerland ticked and no keyword, or even the keyword “a”, it leads with Microsoft, Google and other companies outside Switzerland), so the search needs the country name as a keyword, which matches company names. Other keywords (legal forms, cities) would give a biased, country-specific sample, not a complete list. Kept as the option for what it does find well: local branches of international groups.</w:t>
+      </w:r>
+    </w:p>
+    <w:p>
+      <w:r>
+        <w:rPr>
+          <w:b w:val="0"/>
+        </w:rPr>
+        <w:t>Every added account is scored at once (rescoreDerivedPriorities). One undo for the whole run (Remove the accounts the last run added, a soft delete). The dialog’s last-run details list each listing (and LinkedIn band), and how many of the added accounts the LinkedIn work has found since. Web part not yet measured: waiting for Boaz’s run on 10.</w:t>
       </w:r>
     </w:p>
     <w:p>
@@ -10408,13 +10411,13 @@
               <w:rPr>
                 <w:b/>
               </w:rPr>
-              <w:t xml:space="preserve">LinkedIn first, the web as the complement. </w:t>
+              <w:t xml:space="preserve">The web first, LinkedIn optional. </w:t>
             </w:r>
             <w:r>
               <w:rPr>
                 <w:b w:val="0"/>
               </w:rPr>
-              <w:t>One LinkedIn company search per size band costs no money, matches the size bands exactly, and each company arrives with its LinkedIn page - a web-found company needs a LinkedIn visit later anyway. The web covers what LinkedIn cannot: local branches of foreign groups (LinkedIn filters by headquarters), industries without a confirmed LinkedIn id, and the rest of the target when LinkedIn is at its limit. Boaz’s proposal, 2026-09-30</w:t>
+              <w:t>Web listings find the accounts; the LinkedIn company search is an option (off by default) for about a fifth of the target, because it finds mostly local branches of international groups. LinkedIn first was tried the same day and dropped: its free company search does not hold the location filter, and the country-name keyword it then needs matches company names, so the list is neither reliable nor complete. Boaz, 2026-09-30</w:t>
             </w:r>
           </w:p>
         </w:tc>
@@ -10451,7 +10454,7 @@
         <w:rPr>
           <w:b w:val="0"/>
         </w:rPr>
-        <w:t>LinkedIn Discovery started by the pipeline on its own (postponed, decided). Onboarding’s own account discovery does use it, LinkedIn first (D11, 2026-09-30).</w:t>
+        <w:t>LinkedIn Discovery started by the pipeline on its own (postponed, decided). Onboarding’s own account discovery does offer it as an option for local branches of international groups (D11, 2026-09-30).</w:t>
       </w:r>
     </w:p>
     <w:p>

</xml_diff>

<commit_message>
Design: step 3 web discovery measured on 1.2.0.8 (12 of 12, US$0.28, ~US$0.02/account, homegrown companies)
Co-Authored-By: Claude Opus 5.5 <noreply@anthropic.com>
</commit_message>
<xml_diff>
--- a/ONBOARDING_RESEARCH_DESIGN.docx
+++ b/ONBOARDING_RESEARCH_DESIGN.docx
@@ -9767,7 +9767,33 @@
         <w:rPr>
           <w:b w:val="0"/>
         </w:rPr>
-        <w:t>Every added account is scored at once (rescoreDerivedPriorities). One undo for the whole run (Remove the accounts the last run added, a soft delete). The dialog’s last-run details list each listing (and LinkedIn band), and how many of the added accounts the LinkedIn work has found since. Web part not yet measured: waiting for Boaz’s run on 10.</w:t>
+        <w:t>Every added account is scored at once (rescoreDerivedPriorities). One undo for the whole run (Remove the accounts the last run added, a soft delete). The dialog’s last-run details list each listing (and LinkedIn band), and how many of the added accounts the LinkedIn work has found since.</w:t>
+      </w:r>
+    </w:p>
+    <w:p>
+      <w:r>
+        <w:rPr>
+          <w:b/>
+        </w:rPr>
+        <w:t xml:space="preserve">Measured (1.2.0.8, 2026-09-30, web only, target 10 -&gt; 12 wanted, Switzerland, sizes 501+): </w:t>
+      </w:r>
+      <w:r>
+        <w:rPr>
+          <w:b w:val="0"/>
+        </w:rPr>
+        <w:t xml:space="preserve">12 of 12 added for </w:t>
+      </w:r>
+      <w:r>
+        <w:rPr>
+          <w:b/>
+        </w:rPr>
+        <w:t>US$0.28 in all - about US$0.02 per account</w:t>
+      </w:r>
+      <w:r>
+        <w:rPr>
+          <w:b w:val="0"/>
+        </w:rPr>
+        <w:t xml:space="preserve"> (one search for listings about US$0.14; three listings read, about US$0.05 each). 50 rows read, 23 kept after filtering (15 already an account, 6 listed twice, 6 outside the sizes); no fit search needed. The accounts are homegrown companies of the right size (Syngenta, Firmenich, Bell Food Group, Alpiq, Zurich Insurance Group, Raiffeisenbank…) - the opposite of the LinkedIn run’s “X Switzerland” branches. Far below the design’s estimate for discovery. Still to see: how many of them the pipeline finds on LinkedIn.</w:t>
       </w:r>
     </w:p>
     <w:p>

</xml_diff>

<commit_message>
1.2.1 step 4 (1.2.0.9): LinkedIn after the web - lane accounts wait for the lane, one name search then the People page, first 10 Ready first, Scanner at 10
- heldForWebLane: accounts a live web lane run still holds are not offered to the pipeline (design 7.1)
- profileContactToTry takes the most senior contact; after one name search the People page (D2)
- MIN_READY_TO_SCAN 5 -> 10; under 10 Ready, accounts LinkedIn can make Ready go first, fewest touches first (D7)
- Scanner gate shows "6 of 10 accounts Ready, about 25 minutes to go"
- Measurements: visits per account in each Pipeline log line, time to the first 10 Ready, visits per Leads scan
- 18 new pure-module checks (397 in all)

Co-Authored-By: Claude Opus 5.5 <noreply@anthropic.com>
</commit_message>
<xml_diff>
--- a/ONBOARDING_RESEARCH_DESIGN.docx
+++ b/ONBOARDING_RESEARCH_DESIGN.docx
@@ -4578,17 +4578,75 @@
       </w:r>
     </w:p>
     <w:p>
+      <w:pPr>
+        <w:pStyle w:val="IntenseQuote"/>
+      </w:pPr>
       <w:r>
         <w:rPr>
           <w:b/>
         </w:rPr>
-        <w:t xml:space="preserve">D11, 2026-09-30: the web first, LinkedIn optional. </w:t>
-      </w:r>
-      <w:r>
-        <w:rPr>
-          <w:b w:val="0"/>
-        </w:rPr>
-        <w:t>Web listings (sections 4.1-4.4) find the accounts. The LinkedIn company search is an option, off by default, for about a fifth of the target: it finds mostly local branches of international groups, which listings tend to miss. It was tried first the same day (“LinkedIn first”) and dropped as the main source: LinkedIn’s free company search does not hold its location filter, so it needs the country name as a keyword and then returns mostly companies with the country in their name. Details in “As built (step 3)”, section 11.</w:t>
+        <w:t>D11, 2026-09-30: the web first, LinkedIn optional.</w:t>
+      </w:r>
+      <w:r>
+        <w:rPr>
+          <w:b w:val="0"/>
+        </w:rPr>
+        <w:t xml:space="preserve"> Web listings (sections 4.1-4.4) find the accounts. The</w:t>
+      </w:r>
+    </w:p>
+    <w:p>
+      <w:pPr>
+        <w:pStyle w:val="IntenseQuote"/>
+      </w:pPr>
+      <w:r>
+        <w:rPr>
+          <w:b w:val="0"/>
+        </w:rPr>
+        <w:t>LinkedIn company search is an option, off by default, for about a fifth of the target: it finds mostly local</w:t>
+      </w:r>
+    </w:p>
+    <w:p>
+      <w:pPr>
+        <w:pStyle w:val="IntenseQuote"/>
+      </w:pPr>
+      <w:r>
+        <w:rPr>
+          <w:b w:val="0"/>
+        </w:rPr>
+        <w:t>branches of international groups, which listings tend to miss. It was tried first the same day ("LinkedIn first")</w:t>
+      </w:r>
+    </w:p>
+    <w:p>
+      <w:pPr>
+        <w:pStyle w:val="IntenseQuote"/>
+      </w:pPr>
+      <w:r>
+        <w:rPr>
+          <w:b w:val="0"/>
+        </w:rPr>
+        <w:t>and dropped as the main source: LinkedIn's free company search does not hold its location filter, so it needs the</w:t>
+      </w:r>
+    </w:p>
+    <w:p>
+      <w:pPr>
+        <w:pStyle w:val="IntenseQuote"/>
+      </w:pPr>
+      <w:r>
+        <w:rPr>
+          <w:b w:val="0"/>
+        </w:rPr>
+        <w:t>country name as a keyword and then returns mostly companies with the country in their name. Details in "As built</w:t>
+      </w:r>
+    </w:p>
+    <w:p>
+      <w:pPr>
+        <w:pStyle w:val="IntenseQuote"/>
+      </w:pPr>
+      <w:r>
+        <w:rPr>
+          <w:b w:val="0"/>
+        </w:rPr>
+        <w:t>(step 3)", section 11.</w:t>
       </w:r>
     </w:p>
     <w:p>
@@ -8363,11 +8421,12 @@
             <w:tcW w:type="dxa" w:w="2160"/>
           </w:tcPr>
           <w:p>
+            <w:r/>
             <w:r>
               <w:rPr>
                 <w:b w:val="0"/>
               </w:rPr>
-              <w:t>Account discovery from web listings; optional LinkedIn search for local branches (D11); Advanced &gt; Find new accounts (new)</w:t>
+              <w:t>Account discovery from web listings; optional LinkedIn search for local branches (D11); Advanced &gt; *Find new accounts (new)*</w:t>
             </w:r>
           </w:p>
         </w:tc>
@@ -8376,11 +8435,12 @@
             <w:tcW w:type="dxa" w:w="2160"/>
           </w:tcPr>
           <w:p>
+            <w:r/>
             <w:r>
               <w:rPr>
                 <w:b w:val="0"/>
               </w:rPr>
-              <w:t>new accounts appear as “Web” (and “Discovered” from LinkedIn)</w:t>
+              <w:t>new accounts appear as "Web" (and "Discovered" from LinkedIn)</w:t>
             </w:r>
           </w:p>
         </w:tc>
@@ -8389,6 +8449,7 @@
             <w:tcW w:type="dxa" w:w="2160"/>
           </w:tcPr>
           <w:p>
+            <w:r/>
             <w:r>
               <w:rPr>
                 <w:b/>
@@ -9705,13 +9766,36 @@
         <w:rPr>
           <w:b/>
         </w:rPr>
-        <w:t xml:space="preserve">As built (step 3, 1.2.0.8) - the web first, LinkedIn optional (D11). </w:t>
-      </w:r>
-      <w:r>
-        <w:rPr>
-          <w:b w:val="0"/>
-        </w:rPr>
-        <w:t>Advanced tools &gt; Find new accounts (new)… (all four pages) asks for a target (default 10), a web cost cap, and whether to also search LinkedIn. web-discovery.js (background):</w:t>
+        <w:t>As built (step 3, 1.2.0.8) - the web first, LinkedIn optional (D11).</w:t>
+      </w:r>
+      <w:r>
+        <w:rPr>
+          <w:b w:val="0"/>
+        </w:rPr>
+        <w:t xml:space="preserve"> Advanced tools &gt; *Find new accounts</w:t>
+      </w:r>
+    </w:p>
+    <w:p>
+      <w:r>
+        <w:rPr>
+          <w:b w:val="0"/>
+        </w:rPr>
+        <w:t>(new)…* (all four pages) asks for a target (default 10), a web cost cap, and whether to also search LinkedIn.</w:t>
+      </w:r>
+    </w:p>
+    <w:p>
+      <w:r>
+        <w:rPr>
+          <w:rFonts w:ascii="Consolas" w:hAnsi="Consolas"/>
+          <w:b w:val="0"/>
+        </w:rPr>
+        <w:t>web-discovery.js</w:t>
+      </w:r>
+      <w:r>
+        <w:rPr>
+          <w:b w:val="0"/>
+        </w:rPr>
+        <w:t xml:space="preserve"> (background):</w:t>
       </w:r>
     </w:p>
     <w:p>
@@ -9722,13 +9806,154 @@
         <w:rPr>
           <w:b/>
         </w:rPr>
-        <w:t xml:space="preserve">The web </w:t>
-      </w:r>
-      <w:r>
-        <w:rPr>
-          <w:b w:val="0"/>
-        </w:rPr>
-        <w:t>finds the accounts: up to five listing pages per country found with web_search, each read with web_fetch (30,000 tokens a page, a second page if the list continues); rows filtered by discovery-filter.js (pure, tested): seller, exclusions, removed, existing, listed twice, then size band, industry (the call maps a stated industry onto the wizard’s names; only a clear “none” drops the row) and excluded organisation types. When the listings run short, the fit search. chooseDiscoveryRows: included companies first, then per band (bandTargets: target x 1.15 split by band priority) by pre-score, centre of the band, listing rank; rows without a headcount last. Added as “Web” rows (addWebDiscoveredCompanies, under the write lock); the pipeline looks each up on LinkedIn later.</w:t>
+        <w:t>The web</w:t>
+      </w:r>
+      <w:r>
+        <w:rPr>
+          <w:b w:val="0"/>
+        </w:rPr>
+        <w:t xml:space="preserve"> finds the accounts: up to five listing pages per country found with </w:t>
+      </w:r>
+      <w:r>
+        <w:rPr>
+          <w:rFonts w:ascii="Consolas" w:hAnsi="Consolas"/>
+          <w:b w:val="0"/>
+        </w:rPr>
+        <w:t>web_search</w:t>
+      </w:r>
+      <w:r>
+        <w:rPr>
+          <w:b w:val="0"/>
+        </w:rPr>
+        <w:t>, each read with</w:t>
+      </w:r>
+    </w:p>
+    <w:p>
+      <w:r>
+        <w:rPr>
+          <w:b w:val="0"/>
+        </w:rPr>
+        <w:t xml:space="preserve">   </w:t>
+      </w:r>
+      <w:r>
+        <w:rPr>
+          <w:rFonts w:ascii="Consolas" w:hAnsi="Consolas"/>
+          <w:b w:val="0"/>
+        </w:rPr>
+        <w:t>web_fetch</w:t>
+      </w:r>
+      <w:r>
+        <w:rPr>
+          <w:b w:val="0"/>
+        </w:rPr>
+        <w:t xml:space="preserve"> (30,000 tokens a page, a second page if the list continues); rows filtered by </w:t>
+      </w:r>
+      <w:r>
+        <w:rPr>
+          <w:rFonts w:ascii="Consolas" w:hAnsi="Consolas"/>
+          <w:b w:val="0"/>
+        </w:rPr>
+        <w:t>discovery-filter.js</w:t>
+      </w:r>
+    </w:p>
+    <w:p>
+      <w:r>
+        <w:rPr>
+          <w:b w:val="0"/>
+        </w:rPr>
+        <w:t xml:space="preserve">   (pure, tested): seller, exclusions, removed, existing, listed twice, then size band, industry (the call maps a</w:t>
+      </w:r>
+    </w:p>
+    <w:p>
+      <w:r>
+        <w:rPr>
+          <w:b w:val="0"/>
+        </w:rPr>
+        <w:t xml:space="preserve">   stated industry onto the wizard's names; only a clear "none" drops the row) and excluded organisation types. When</w:t>
+      </w:r>
+    </w:p>
+    <w:p>
+      <w:r>
+        <w:rPr>
+          <w:b w:val="0"/>
+        </w:rPr>
+        <w:t xml:space="preserve">   the listings run short, the fit search. </w:t>
+      </w:r>
+      <w:r>
+        <w:rPr>
+          <w:rFonts w:ascii="Consolas" w:hAnsi="Consolas"/>
+          <w:b w:val="0"/>
+        </w:rPr>
+        <w:t>chooseDiscoveryRows</w:t>
+      </w:r>
+      <w:r>
+        <w:rPr>
+          <w:b w:val="0"/>
+        </w:rPr>
+        <w:t>: included companies first, then per band</w:t>
+      </w:r>
+    </w:p>
+    <w:p>
+      <w:r>
+        <w:rPr>
+          <w:b w:val="0"/>
+        </w:rPr>
+        <w:t xml:space="preserve">   (</w:t>
+      </w:r>
+      <w:r>
+        <w:rPr>
+          <w:rFonts w:ascii="Consolas" w:hAnsi="Consolas"/>
+          <w:b w:val="0"/>
+        </w:rPr>
+        <w:t>bandTargets</w:t>
+      </w:r>
+      <w:r>
+        <w:rPr>
+          <w:b w:val="0"/>
+        </w:rPr>
+        <w:t xml:space="preserve">: </w:t>
+      </w:r>
+      <w:r>
+        <w:rPr>
+          <w:rFonts w:ascii="Consolas" w:hAnsi="Consolas"/>
+          <w:b w:val="0"/>
+        </w:rPr>
+        <w:t>target x 1.15</w:t>
+      </w:r>
+      <w:r>
+        <w:rPr>
+          <w:b w:val="0"/>
+        </w:rPr>
+        <w:t xml:space="preserve"> split by band priority) by pre-score, centre of the band, listing rank; rows</w:t>
+      </w:r>
+    </w:p>
+    <w:p>
+      <w:r>
+        <w:rPr>
+          <w:b w:val="0"/>
+        </w:rPr>
+        <w:t xml:space="preserve">   without a headcount last. Added as "Web" rows (</w:t>
+      </w:r>
+      <w:r>
+        <w:rPr>
+          <w:rFonts w:ascii="Consolas" w:hAnsi="Consolas"/>
+          <w:b w:val="0"/>
+        </w:rPr>
+        <w:t>addWebDiscoveredCompanies</w:t>
+      </w:r>
+      <w:r>
+        <w:rPr>
+          <w:b w:val="0"/>
+        </w:rPr>
+        <w:t>, under the write lock); the pipeline</w:t>
+      </w:r>
+    </w:p>
+    <w:p>
+      <w:r>
+        <w:rPr>
+          <w:b w:val="0"/>
+        </w:rPr>
+        <w:t xml:space="preserve">   looks each up on LinkedIn later.</w:t>
       </w:r>
     </w:p>
     <w:p>
@@ -9739,13 +9964,71 @@
         <w:rPr>
           <w:b/>
         </w:rPr>
-        <w:t xml:space="preserve">LinkedIn, only when ticked, </w:t>
-      </w:r>
-      <w:r>
-        <w:rPr>
-          <w:b w:val="0"/>
-        </w:rPr>
-        <w:t>for about a fifth of the target plus what the web fell short of: the automatic pipeline steps aside; under one batch lock the existing company Discovery (company-discovery-extraction.js) runs once per size band, in a small unfocused window (as the pipeline’s), with the country name as keyword and headquarters confirmed in a target country; merged via autoMergeDiscoveryResults (a name-only match waits in the decision queue).</w:t>
+        <w:t>LinkedIn, only when ticked</w:t>
+      </w:r>
+      <w:r>
+        <w:rPr>
+          <w:b w:val="0"/>
+        </w:rPr>
+        <w:t>, for about a fifth of the target plus what the web fell short of: the automatic</w:t>
+      </w:r>
+    </w:p>
+    <w:p>
+      <w:r>
+        <w:rPr>
+          <w:b w:val="0"/>
+        </w:rPr>
+        <w:t xml:space="preserve">   pipeline steps aside; under one batch lock the existing company Discovery (</w:t>
+      </w:r>
+      <w:r>
+        <w:rPr>
+          <w:rFonts w:ascii="Consolas" w:hAnsi="Consolas"/>
+          <w:b w:val="0"/>
+        </w:rPr>
+        <w:t>company-discovery-extraction.js</w:t>
+      </w:r>
+      <w:r>
+        <w:rPr>
+          <w:b w:val="0"/>
+        </w:rPr>
+        <w:t>)</w:t>
+      </w:r>
+    </w:p>
+    <w:p>
+      <w:r>
+        <w:rPr>
+          <w:b w:val="0"/>
+        </w:rPr>
+        <w:t xml:space="preserve">   runs once per size band, in a small unfocused window (as the pipeline's), with the country name as keyword and</w:t>
+      </w:r>
+    </w:p>
+    <w:p>
+      <w:r>
+        <w:rPr>
+          <w:b w:val="0"/>
+        </w:rPr>
+        <w:t xml:space="preserve">   headquarters confirmed in a target country; merged via </w:t>
+      </w:r>
+      <w:r>
+        <w:rPr>
+          <w:rFonts w:ascii="Consolas" w:hAnsi="Consolas"/>
+          <w:b w:val="0"/>
+        </w:rPr>
+        <w:t>autoMergeDiscoveryResults</w:t>
+      </w:r>
+      <w:r>
+        <w:rPr>
+          <w:b w:val="0"/>
+        </w:rPr>
+        <w:t xml:space="preserve"> (a name-only match waits in</w:t>
+      </w:r>
+    </w:p>
+    <w:p>
+      <w:r>
+        <w:rPr>
+          <w:b w:val="0"/>
+        </w:rPr>
+        <w:t xml:space="preserve">   the decision queue).</w:t>
       </w:r>
     </w:p>
     <w:p>
@@ -9753,21 +10036,98 @@
         <w:rPr>
           <w:b/>
         </w:rPr>
-        <w:t xml:space="preserve">Why LinkedIn is not the main source (2026-09-30). </w:t>
-      </w:r>
-      <w:r>
-        <w:rPr>
-          <w:b w:val="0"/>
-        </w:rPr>
-        <w:t>A first run with LinkedIn first added 12 accounts from 5 result pages at no cost - but nearly all had the country in their name (Huawei Switzerland, Audi Switzerland, Škoda Switzerland…): LinkedIn’s free company search does not hold its location filter (with Switzerland ticked and no keyword, or even the keyword “a”, it leads with Microsoft, Google and other companies outside Switzerland), so the search needs the country name as a keyword, which matches company names. Other keywords (legal forms, cities) would give a biased, country-specific sample, not a complete list. Kept as the option for what it does find well: local branches of international groups.</w:t>
-      </w:r>
-    </w:p>
-    <w:p>
-      <w:r>
-        <w:rPr>
-          <w:b w:val="0"/>
-        </w:rPr>
-        <w:t>Every added account is scored at once (rescoreDerivedPriorities). One undo for the whole run (Remove the accounts the last run added, a soft delete). The dialog’s last-run details list each listing (and LinkedIn band), and how many of the added accounts the LinkedIn work has found since.</w:t>
+        <w:t>Why LinkedIn is not the main source (2026-09-30).</w:t>
+      </w:r>
+      <w:r>
+        <w:rPr>
+          <w:b w:val="0"/>
+        </w:rPr>
+        <w:t xml:space="preserve"> A first run with LinkedIn first added 12 accounts from 5 result</w:t>
+      </w:r>
+    </w:p>
+    <w:p>
+      <w:r>
+        <w:rPr>
+          <w:b w:val="0"/>
+        </w:rPr>
+        <w:t>pages at no cost - but nearly all had the country in their name (Huawei Switzerland, Audi Switzerland, Škoda</w:t>
+      </w:r>
+    </w:p>
+    <w:p>
+      <w:r>
+        <w:rPr>
+          <w:b w:val="0"/>
+        </w:rPr>
+        <w:t>Switzerland…): LinkedIn's free company search does not hold its location filter (with Switzerland ticked and no</w:t>
+      </w:r>
+    </w:p>
+    <w:p>
+      <w:r>
+        <w:rPr>
+          <w:b w:val="0"/>
+        </w:rPr>
+        <w:t>keyword, or even the keyword "a", it leads with Microsoft, Google and other companies outside Switzerland), so the</w:t>
+      </w:r>
+    </w:p>
+    <w:p>
+      <w:r>
+        <w:rPr>
+          <w:b w:val="0"/>
+        </w:rPr>
+        <w:t>search needs the country name as a keyword, which matches company names. Other keywords (legal forms, cities) would</w:t>
+      </w:r>
+    </w:p>
+    <w:p>
+      <w:r>
+        <w:rPr>
+          <w:b w:val="0"/>
+        </w:rPr>
+        <w:t>give a biased, country-specific sample, not a complete list. Kept as the option for what it does find well: local</w:t>
+      </w:r>
+    </w:p>
+    <w:p>
+      <w:r>
+        <w:rPr>
+          <w:b w:val="0"/>
+        </w:rPr>
+        <w:t>branches of international groups.</w:t>
+      </w:r>
+    </w:p>
+    <w:p>
+      <w:r>
+        <w:rPr>
+          <w:b w:val="0"/>
+        </w:rPr>
+        <w:t>Every added account is scored at once (</w:t>
+      </w:r>
+      <w:r>
+        <w:rPr>
+          <w:rFonts w:ascii="Consolas" w:hAnsi="Consolas"/>
+          <w:b w:val="0"/>
+        </w:rPr>
+        <w:t>rescoreDerivedPriorities</w:t>
+      </w:r>
+      <w:r>
+        <w:rPr>
+          <w:b w:val="0"/>
+        </w:rPr>
+        <w:t>). One undo for the whole run (*Remove the accounts</w:t>
+      </w:r>
+    </w:p>
+    <w:p>
+      <w:r>
+        <w:rPr>
+          <w:b w:val="0"/>
+        </w:rPr>
+        <w:t>the last run added*, a soft delete). The dialog's last-run details list each listing (and LinkedIn band), and how</w:t>
+      </w:r>
+    </w:p>
+    <w:p>
+      <w:r>
+        <w:rPr>
+          <w:b w:val="0"/>
+        </w:rPr>
+        <w:t>many of the added accounts the LinkedIn work has found since.</w:t>
       </w:r>
     </w:p>
     <w:p>
@@ -9775,14 +10135,16 @@
         <w:rPr>
           <w:b/>
         </w:rPr>
-        <w:t xml:space="preserve">Measured (1.2.0.8, 2026-09-30, web only, target 10 -&gt; 12 wanted, Switzerland, sizes 501+): </w:t>
-      </w:r>
-      <w:r>
-        <w:rPr>
-          <w:b w:val="0"/>
-        </w:rPr>
-        <w:t xml:space="preserve">12 of 12 added for </w:t>
-      </w:r>
+        <w:t>Measured (1.2.0.8, 2026-09-30, web only, target 10 -&gt; 12 wanted, Switzerland, sizes 501+):</w:t>
+      </w:r>
+      <w:r>
+        <w:rPr>
+          <w:b w:val="0"/>
+        </w:rPr>
+        <w:t xml:space="preserve"> 12 of 12 added for</w:t>
+      </w:r>
+    </w:p>
+    <w:p>
       <w:r>
         <w:rPr>
           <w:b/>
@@ -9793,7 +10155,515 @@
         <w:rPr>
           <w:b w:val="0"/>
         </w:rPr>
-        <w:t xml:space="preserve"> (one search for listings about US$0.14; three listings read, about US$0.05 each). 50 rows read, 23 kept after filtering (15 already an account, 6 listed twice, 6 outside the sizes); no fit search needed. The accounts are homegrown companies of the right size (Syngenta, Firmenich, Bell Food Group, Alpiq, Zurich Insurance Group, Raiffeisenbank…) - the opposite of the LinkedIn run’s “X Switzerland” branches. Far below the design’s estimate for discovery. Still to see: how many of them the pipeline finds on LinkedIn.</w:t>
+        <w:t xml:space="preserve"> (one search for listings about US$0.14; three listings read, about</w:t>
+      </w:r>
+    </w:p>
+    <w:p>
+      <w:r>
+        <w:rPr>
+          <w:b w:val="0"/>
+        </w:rPr>
+        <w:t>US$0.05 each). 50 rows read, 23 kept after filtering (15 already an account, 6 listed twice, 6 outside the sizes);</w:t>
+      </w:r>
+    </w:p>
+    <w:p>
+      <w:r>
+        <w:rPr>
+          <w:b w:val="0"/>
+        </w:rPr>
+        <w:t>no fit search needed. The accounts are homegrown companies of the right size (Syngenta, Firmenich, Bell Food Group,</w:t>
+      </w:r>
+    </w:p>
+    <w:p>
+      <w:r>
+        <w:rPr>
+          <w:b w:val="0"/>
+        </w:rPr>
+        <w:t>Alpiq, Zurich Insurance Group, Raiffeisenbank…) - the opposite of the LinkedIn run's "X Switzerland" branches. Far</w:t>
+      </w:r>
+    </w:p>
+    <w:p>
+      <w:r>
+        <w:rPr>
+          <w:b w:val="0"/>
+        </w:rPr>
+        <w:t>below the design's estimate for discovery. Still to see: how many of them the pipeline finds on LinkedIn.</w:t>
+      </w:r>
+    </w:p>
+    <w:p>
+      <w:r>
+        <w:rPr>
+          <w:b/>
+        </w:rPr>
+        <w:t>As built (step 4, 1.2.0.9) - LinkedIn after the web.</w:t>
+      </w:r>
+      <w:r>
+        <w:rPr>
+          <w:b w:val="0"/>
+        </w:rPr>
+        <w:t xml:space="preserve"> All in the existing pipeline (</w:t>
+      </w:r>
+      <w:r>
+        <w:rPr>
+          <w:rFonts w:ascii="Consolas" w:hAnsi="Consolas"/>
+          <w:b w:val="0"/>
+        </w:rPr>
+        <w:t>pipeline-plan.js</w:t>
+      </w:r>
+      <w:r>
+        <w:rPr>
+          <w:b w:val="0"/>
+        </w:rPr>
+        <w:t>,</w:t>
+      </w:r>
+    </w:p>
+    <w:p>
+      <w:r>
+        <w:rPr>
+          <w:rFonts w:ascii="Consolas" w:hAnsi="Consolas"/>
+          <w:b w:val="0"/>
+        </w:rPr>
+        <w:t>pipeline-runner.js</w:t>
+      </w:r>
+      <w:r>
+        <w:rPr>
+          <w:b w:val="0"/>
+        </w:rPr>
+        <w:t>); nothing new on screen except the Scanner's gate.</w:t>
+      </w:r>
+    </w:p>
+    <w:p>
+      <w:pPr>
+        <w:pStyle w:val="ListBullet"/>
+      </w:pPr>
+      <w:r>
+        <w:rPr>
+          <w:b/>
+        </w:rPr>
+        <w:t>7.1, the web lane goes first:</w:t>
+      </w:r>
+      <w:r>
+        <w:rPr>
+          <w:b w:val="0"/>
+        </w:rPr>
+        <w:t xml:space="preserve"> a web lane run now records the accounts it still has to research</w:t>
+      </w:r>
+    </w:p>
+    <w:p>
+      <w:r>
+        <w:rPr>
+          <w:b w:val="0"/>
+        </w:rPr>
+        <w:t xml:space="preserve">  (</w:t>
+      </w:r>
+      <w:r>
+        <w:rPr>
+          <w:rFonts w:ascii="Consolas" w:hAnsi="Consolas"/>
+          <w:b w:val="0"/>
+        </w:rPr>
+        <w:t>pendingKeys</w:t>
+      </w:r>
+      <w:r>
+        <w:rPr>
+          <w:b w:val="0"/>
+        </w:rPr>
+        <w:t xml:space="preserve">, queued or running). </w:t>
+      </w:r>
+      <w:r>
+        <w:rPr>
+          <w:rFonts w:ascii="Consolas" w:hAnsi="Consolas"/>
+          <w:b w:val="0"/>
+        </w:rPr>
+        <w:t>heldForWebLane</w:t>
+      </w:r>
+      <w:r>
+        <w:rPr>
+          <w:b w:val="0"/>
+        </w:rPr>
+        <w:t xml:space="preserve"> keeps them out of </w:t>
+      </w:r>
+      <w:r>
+        <w:rPr>
+          <w:rFonts w:ascii="Consolas" w:hAnsi="Consolas"/>
+          <w:b w:val="0"/>
+        </w:rPr>
+        <w:t>rankCandidates</w:t>
+      </w:r>
+      <w:r>
+        <w:rPr>
+          <w:b w:val="0"/>
+        </w:rPr>
+        <w:t xml:space="preserve"> while the run is</w:t>
+      </w:r>
+    </w:p>
+    <w:p>
+      <w:r>
+        <w:rPr>
+          <w:b w:val="0"/>
+        </w:rPr>
+        <w:t xml:space="preserve">  alive; a run that has stopped (budget, key, 429), whose record is more than 2 minutes old (a reload), or that</w:t>
+      </w:r>
+    </w:p>
+    <w:p>
+      <w:r>
+        <w:rPr>
+          <w:b w:val="0"/>
+        </w:rPr>
+        <w:t xml:space="preserve">  started more than a day ago holds nothing.</w:t>
+      </w:r>
+    </w:p>
+    <w:p>
+      <w:pPr>
+        <w:pStyle w:val="ListBullet"/>
+      </w:pPr>
+      <w:r>
+        <w:rPr>
+          <w:b/>
+        </w:rPr>
+        <w:t>7.2 / D2, one name search, then the People page:</w:t>
+      </w:r>
+      <w:r>
+        <w:rPr>
+          <w:b w:val="0"/>
+        </w:rPr>
+        <w:t xml:space="preserve"> account views now carry each contact's seniority level</w:t>
+      </w:r>
+    </w:p>
+    <w:p>
+      <w:r>
+        <w:rPr>
+          <w:b w:val="0"/>
+        </w:rPr>
+        <w:t xml:space="preserve">  (</w:t>
+      </w:r>
+      <w:r>
+        <w:rPr>
+          <w:rFonts w:ascii="Consolas" w:hAnsi="Consolas"/>
+          <w:b w:val="0"/>
+        </w:rPr>
+        <w:t>level</w:t>
+      </w:r>
+      <w:r>
+        <w:rPr>
+          <w:b w:val="0"/>
+        </w:rPr>
+        <w:t xml:space="preserve">) and </w:t>
+      </w:r>
+      <w:r>
+        <w:rPr>
+          <w:rFonts w:ascii="Consolas" w:hAnsi="Consolas"/>
+          <w:b w:val="0"/>
+        </w:rPr>
+        <w:t>source</w:t>
+      </w:r>
+      <w:r>
+        <w:rPr>
+          <w:b w:val="0"/>
+        </w:rPr>
+        <w:t xml:space="preserve">; </w:t>
+      </w:r>
+      <w:r>
+        <w:rPr>
+          <w:rFonts w:ascii="Consolas" w:hAnsi="Consolas"/>
+          <w:b w:val="0"/>
+        </w:rPr>
+        <w:t>profileContactToTry</w:t>
+      </w:r>
+      <w:r>
+        <w:rPr>
+          <w:b w:val="0"/>
+        </w:rPr>
+        <w:t xml:space="preserve"> takes the </w:t>
+      </w:r>
+      <w:r>
+        <w:rPr>
+          <w:b/>
+        </w:rPr>
+        <w:t>most senior</w:t>
+      </w:r>
+      <w:r>
+        <w:rPr>
+          <w:b w:val="0"/>
+        </w:rPr>
+        <w:t xml:space="preserve"> relevant contact without a profile</w:t>
+      </w:r>
+    </w:p>
+    <w:p>
+      <w:r>
+        <w:rPr>
+          <w:b w:val="0"/>
+        </w:rPr>
+        <w:t xml:space="preserve">  first. After one name search in a pass, </w:t>
+      </w:r>
+      <w:r>
+        <w:rPr>
+          <w:rFonts w:ascii="Consolas" w:hAnsi="Consolas"/>
+          <w:b w:val="0"/>
+        </w:rPr>
+        <w:t>jobsNeeded</w:t>
+      </w:r>
+      <w:r>
+        <w:rPr>
+          <w:b w:val="0"/>
+        </w:rPr>
+        <w:t xml:space="preserve"> offers the People page (</w:t>
+      </w:r>
+      <w:r>
+        <w:rPr>
+          <w:rFonts w:ascii="Consolas" w:hAnsi="Consolas"/>
+          <w:b w:val="0"/>
+        </w:rPr>
+        <w:t>contacts</w:t>
+      </w:r>
+      <w:r>
+        <w:rPr>
+          <w:b w:val="0"/>
+        </w:rPr>
+        <w:t>) instead of a second</w:t>
+      </w:r>
+    </w:p>
+    <w:p>
+      <w:r>
+        <w:rPr>
+          <w:b w:val="0"/>
+        </w:rPr>
+        <w:t xml:space="preserve">  name search; only once the People page has given up (two failed days) are further names searched (up to 3 a</w:t>
+      </w:r>
+    </w:p>
+    <w:p>
+      <w:r>
+        <w:rPr>
+          <w:b w:val="0"/>
+        </w:rPr>
+        <w:t xml:space="preserve">  day, as before). Resolve already uses the LinkedIn company link the web found (D10), and size already rides on</w:t>
+      </w:r>
+    </w:p>
+    <w:p>
+      <w:r>
+        <w:rPr>
+          <w:b w:val="0"/>
+        </w:rPr>
+        <w:t xml:space="preserve">  the resolve visit or is skipped when the web gave a cited count.</w:t>
+      </w:r>
+    </w:p>
+    <w:p>
+      <w:pPr>
+        <w:pStyle w:val="ListBullet"/>
+      </w:pPr>
+      <w:r>
+        <w:rPr>
+          <w:b/>
+        </w:rPr>
+        <w:t>7.3 / D7, the first 10 Ready:</w:t>
+      </w:r>
+      <w:r>
+        <w:rPr>
+          <w:b w:val="0"/>
+        </w:rPr>
+        <w:t xml:space="preserve"> </w:t>
+      </w:r>
+      <w:r>
+        <w:rPr>
+          <w:rFonts w:ascii="Consolas" w:hAnsi="Consolas"/>
+          <w:b w:val="0"/>
+        </w:rPr>
+        <w:t>MIN_READY_TO_SCAN</w:t>
+      </w:r>
+      <w:r>
+        <w:rPr>
+          <w:b w:val="0"/>
+        </w:rPr>
+        <w:t xml:space="preserve"> is </w:t>
+      </w:r>
+      <w:r>
+        <w:rPr>
+          <w:b/>
+        </w:rPr>
+        <w:t>10</w:t>
+      </w:r>
+      <w:r>
+        <w:rPr>
+          <w:b w:val="0"/>
+        </w:rPr>
+        <w:t>. While fewer accounts are Ready,</w:t>
+      </w:r>
+    </w:p>
+    <w:p>
+      <w:r>
+        <w:rPr>
+          <w:b w:val="0"/>
+        </w:rPr>
+        <w:t xml:space="preserve">  </w:t>
+      </w:r>
+      <w:r>
+        <w:rPr>
+          <w:rFonts w:ascii="Consolas" w:hAnsi="Consolas"/>
+          <w:b w:val="0"/>
+        </w:rPr>
+        <w:t>rankCandidates</w:t>
+      </w:r>
+      <w:r>
+        <w:rPr>
+          <w:b w:val="0"/>
+        </w:rPr>
+        <w:t xml:space="preserve"> (</w:t>
+      </w:r>
+      <w:r>
+        <w:rPr>
+          <w:rFonts w:ascii="Consolas" w:hAnsi="Consolas"/>
+          <w:b w:val="0"/>
+        </w:rPr>
+        <w:t>readyGoal</w:t>
+      </w:r>
+      <w:r>
+        <w:rPr>
+          <w:b w:val="0"/>
+        </w:rPr>
+        <w:t>) puts first the accounts whose remaining gaps LinkedIn can close (id, employees,</w:t>
+      </w:r>
+    </w:p>
+    <w:p>
+      <w:r>
+        <w:rPr>
+          <w:b w:val="0"/>
+        </w:rPr>
+        <w:t xml:space="preserve">  contact, priority - </w:t>
+      </w:r>
+      <w:r>
+        <w:rPr>
+          <w:rFonts w:ascii="Consolas" w:hAnsi="Consolas"/>
+          <w:b w:val="0"/>
+        </w:rPr>
+        <w:t>readyByLinkedin</w:t>
+      </w:r>
+      <w:r>
+        <w:rPr>
+          <w:b w:val="0"/>
+        </w:rPr>
+        <w:t>), fewest estimated touches first, ahead of priority; an account that also</w:t>
+      </w:r>
+    </w:p>
+    <w:p>
+      <w:r>
+        <w:rPr>
+          <w:b w:val="0"/>
+        </w:rPr>
+        <w:t xml:space="preserve">  needs the web for its HQ or industry waits. The jobs already stop at Ready (a contact gap closes with one</w:t>
+      </w:r>
+    </w:p>
+    <w:p>
+      <w:r>
+        <w:rPr>
+          <w:b w:val="0"/>
+        </w:rPr>
+        <w:t xml:space="preserve">  verified contact), so nothing above Ready is done for an account before the goal is met. The Scanner's gate</w:t>
+      </w:r>
+    </w:p>
+    <w:p>
+      <w:r>
+        <w:rPr>
+          <w:b w:val="0"/>
+        </w:rPr>
+        <w:t xml:space="preserve">  says *"6 of 10 accounts Ready, about 25 minutes to go"* while automatic preparation is on</w:t>
+      </w:r>
+    </w:p>
+    <w:p>
+      <w:r>
+        <w:rPr>
+          <w:b w:val="0"/>
+        </w:rPr>
+        <w:t xml:space="preserve">  (</w:t>
+      </w:r>
+      <w:r>
+        <w:rPr>
+          <w:rFonts w:ascii="Consolas" w:hAnsi="Consolas"/>
+          <w:b w:val="0"/>
+        </w:rPr>
+        <w:t>readyEtaMinutes</w:t>
+      </w:r>
+      <w:r>
+        <w:rPr>
+          <w:b w:val="0"/>
+        </w:rPr>
+        <w:t>: 6 minutes per Ready account to come until 3 have been measured, then the measured pace).</w:t>
+      </w:r>
+    </w:p>
+    <w:p>
+      <w:pPr>
+        <w:pStyle w:val="ListBullet"/>
+      </w:pPr>
+      <w:r>
+        <w:rPr>
+          <w:b/>
+        </w:rPr>
+        <w:t>Measurements:</w:t>
+      </w:r>
+      <w:r>
+        <w:rPr>
+          <w:b w:val="0"/>
+        </w:rPr>
+        <w:t xml:space="preserve"> every *Pipeline:* Activity Log line ends with the account's LinkedIn page visits and "now</w:t>
+      </w:r>
+    </w:p>
+    <w:p>
+      <w:r>
+        <w:rPr>
+          <w:b w:val="0"/>
+        </w:rPr>
+        <w:t xml:space="preserve">  Ready"; the first run that finds fewer than 10 Ready starts </w:t>
+      </w:r>
+      <w:r>
+        <w:rPr>
+          <w:rFonts w:ascii="Consolas" w:hAnsi="Consolas"/>
+          <w:b w:val="0"/>
+        </w:rPr>
+        <w:t>pipelineReadyGoal</w:t>
+      </w:r>
+      <w:r>
+        <w:rPr>
+          <w:b w:val="0"/>
+        </w:rPr>
+        <w:t xml:space="preserve"> (accounts, visits, pipeline</w:t>
+      </w:r>
+    </w:p>
+    <w:p>
+      <w:r>
+        <w:rPr>
+          <w:b w:val="0"/>
+        </w:rPr>
+        <w:t xml:space="preserve">  work time), and reaching 10 writes one line - *"First 10 accounts Ready (from N): X min after the pipeline</w:t>
+      </w:r>
+    </w:p>
+    <w:p>
+      <w:r>
+        <w:rPr>
+          <w:b w:val="0"/>
+        </w:rPr>
+        <w:t xml:space="preserve">  started, Y min of pipeline work, Z LinkedIn page visits on W accounts"*. Every Leads scan writes *"Leads</w:t>
+      </w:r>
+    </w:p>
+    <w:p>
+      <w:r>
+        <w:rPr>
+          <w:b w:val="0"/>
+        </w:rPr>
+        <w:t xml:space="preserve">  scan: N LinkedIn page visits in M min"* (D7: are 39 free touches enough?). Measured once per install, so on</w:t>
+      </w:r>
+    </w:p>
+    <w:p>
+      <w:r>
+        <w:rPr>
+          <w:b w:val="0"/>
+        </w:rPr>
+        <w:t xml:space="preserve">  an install that already has 10 Ready only the per-account and per-scan lines apply; time to 10 Ready needs</w:t>
+      </w:r>
+    </w:p>
+    <w:p>
+      <w:r>
+        <w:rPr>
+          <w:b w:val="0"/>
+        </w:rPr>
+        <w:t xml:space="preserve">  the small test target (Boaz's end goal, 10 accounts).</w:t>
       </w:r>
     </w:p>
     <w:p>
@@ -10407,6 +11277,7 @@
             <w:tcW w:type="dxa" w:w="2880"/>
           </w:tcPr>
           <w:p>
+            <w:r/>
             <w:r>
               <w:rPr>
                 <w:b/>
@@ -10420,6 +11291,7 @@
             <w:tcW w:type="dxa" w:w="2880"/>
           </w:tcPr>
           <w:p>
+            <w:r/>
             <w:r>
               <w:rPr>
                 <w:b w:val="0"/>
@@ -10433,17 +11305,18 @@
             <w:tcW w:type="dxa" w:w="2880"/>
           </w:tcPr>
           <w:p>
+            <w:r/>
             <w:r>
               <w:rPr>
                 <w:b/>
               </w:rPr>
-              <w:t xml:space="preserve">The web first, LinkedIn optional. </w:t>
+              <w:t>The web first, LinkedIn optional.</w:t>
             </w:r>
             <w:r>
               <w:rPr>
                 <w:b w:val="0"/>
               </w:rPr>
-              <w:t>Web listings find the accounts; the LinkedIn company search is an option (off by default) for about a fifth of the target, because it finds mostly local branches of international groups. LinkedIn first was tried the same day and dropped: its free company search does not hold the location filter, and the country-name keyword it then needs matches company names, so the list is neither reliable nor complete. Boaz, 2026-09-30</w:t>
+              <w:t xml:space="preserve"> Web listings find the accounts; the LinkedIn company search is an option (off by default) for about a fifth of the target, because it finds mostly local branches of international groups. LinkedIn first was tried the same day and dropped: its free company search does not hold the location filter, and the country-name keyword it then needs matches company names, so the list is neither reliable nor complete. Boaz, 2026-09-30</w:t>
             </w:r>
           </w:p>
         </w:tc>
@@ -10480,7 +11353,15 @@
         <w:rPr>
           <w:b w:val="0"/>
         </w:rPr>
-        <w:t>LinkedIn Discovery started by the pipeline on its own (postponed, decided). Onboarding’s own account discovery does offer it as an option for local branches of international groups (D11, 2026-09-30).</w:t>
+        <w:t>LinkedIn Discovery started by the pipeline on its own (postponed, decided). Onboarding's own account discovery does</w:t>
+      </w:r>
+    </w:p>
+    <w:p>
+      <w:r>
+        <w:rPr>
+          <w:b w:val="0"/>
+        </w:rPr>
+        <w:t xml:space="preserve">  offer it as an option for local branches of international groups (D11, 2026-09-30).</w:t>
       </w:r>
     </w:p>
     <w:p>

</xml_diff>

<commit_message>
1.2.0.10: the web goes on while LinkedIn waits - the web lane starts automatically at the LinkedIn limit, and the top bar says what the web side is doing
- kickPipeline starts the web lane (20 accounts, auto) when the LinkedIn limit is reached and the web budget allows
- automatic lane runs count against the monthly web budget, stop on automation off / paused today / budget, no pop-up
- top bar: "resumes around 09:06 PM · web research goes on (3 of 20 accounts)" or why it does not

Co-Authored-By: Claude Opus 5.5 <noreply@anthropic.com>
</commit_message>
<xml_diff>
--- a/ONBOARDING_RESEARCH_DESIGN.docx
+++ b/ONBOARDING_RESEARCH_DESIGN.docx
@@ -10664,6 +10664,104 @@
           <w:b w:val="0"/>
         </w:rPr>
         <w:t xml:space="preserve">  the small test target (Boaz's end goal, 10 accounts).</w:t>
+      </w:r>
+    </w:p>
+    <w:p>
+      <w:r>
+        <w:rPr>
+          <w:b/>
+        </w:rPr>
+        <w:t>1.2.0.10 (Boaz, 2026-10-01) - the web goes on while LinkedIn waits.</w:t>
+      </w:r>
+      <w:r>
+        <w:rPr>
+          <w:b w:val="0"/>
+        </w:rPr>
+        <w:t xml:space="preserve"> With the pipeline's LinkedIn visits used up</w:t>
+      </w:r>
+    </w:p>
+    <w:p>
+      <w:r>
+        <w:rPr>
+          <w:b w:val="0"/>
+        </w:rPr>
+        <w:t>the top bar said only *"LinkedIn limit for automation reached"*, and nothing ran on the web: the pipeline's own web</w:t>
+      </w:r>
+    </w:p>
+    <w:p>
+      <w:r>
+        <w:rPr>
+          <w:b w:val="0"/>
+        </w:rPr>
+        <w:t>research (missing headcount or HQ, a full research once a year) had nothing left, and the web lane ran only by hand.</w:t>
+      </w:r>
+    </w:p>
+    <w:p>
+      <w:r>
+        <w:rPr>
+          <w:b w:val="0"/>
+        </w:rPr>
+        <w:t>Now (a part of step 6 brought forward): when a kick finds the LinkedIn limit reached and the pipeline idle, and the</w:t>
+      </w:r>
+    </w:p>
+    <w:p>
+      <w:r>
+        <w:rPr>
+          <w:b w:val="0"/>
+        </w:rPr>
+        <w:t xml:space="preserve">monthly web budget allows, it starts the </w:t>
+      </w:r>
+      <w:r>
+        <w:rPr>
+          <w:b/>
+        </w:rPr>
+        <w:t>web lane automatically</w:t>
+      </w:r>
+      <w:r>
+        <w:rPr>
+          <w:b w:val="0"/>
+        </w:rPr>
+        <w:t>, 20 accounts per run. Each account's cost counts</w:t>
+      </w:r>
+    </w:p>
+    <w:p>
+      <w:r>
+        <w:rPr>
+          <w:b w:val="0"/>
+        </w:rPr>
+        <w:t>against the monthly web budget; before every account the run checks that automatic preparation is on, not paused</w:t>
+      </w:r>
+    </w:p>
+    <w:p>
+      <w:r>
+        <w:rPr>
+          <w:b w:val="0"/>
+        </w:rPr>
+        <w:t>for today, and that the budget still allows; an empty credit balance or a Console limit blocks the pipeline's web</w:t>
+      </w:r>
+    </w:p>
+    <w:p>
+      <w:r>
+        <w:rPr>
+          <w:b w:val="0"/>
+        </w:rPr>
+        <w:t>research for the day too. No pop-up at the end, one Activity Log line (*"Automatic web research: ..."*). The bar</w:t>
+      </w:r>
+    </w:p>
+    <w:p>
+      <w:r>
+        <w:rPr>
+          <w:b w:val="0"/>
+        </w:rPr>
+        <w:t>says what the web side is doing: *"... resumes around 09:06 PM · web research goes on (3 of 20 accounts)"*, or</w:t>
+      </w:r>
+    </w:p>
+    <w:p>
+      <w:r>
+        <w:rPr>
+          <w:b w:val="0"/>
+        </w:rPr>
+        <w:t>*"· no account needs web research just now"*, *"· web research is off"*, *"· web research budget used up"*.</w:t>
       </w:r>
     </w:p>
     <w:p>

</xml_diff>

<commit_message>
1.2.0.12: web research names at most 5 people per account, at the Setup seniority levels, most senior first (first automatic run: 6-16 people, US$0.22 per account)
Co-Authored-By: Claude Opus 5.5 <noreply@anthropic.com>
</commit_message>
<xml_diff>
--- a/ONBOARDING_RESEARCH_DESIGN.docx
+++ b/ONBOARDING_RESEARCH_DESIGN.docx
@@ -10762,6 +10762,85 @@
           <w:b w:val="0"/>
         </w:rPr>
         <w:t>*"· no account needs web research just now"*, *"· web research is off"*, *"· web research budget used up"*.</w:t>
+      </w:r>
+    </w:p>
+    <w:p>
+      <w:r>
+        <w:rPr>
+          <w:b/>
+        </w:rPr>
+        <w:t>First automatic run (1.2.0.10, 2026-10-01, 20 accounts):</w:t>
+      </w:r>
+      <w:r>
+        <w:rPr>
+          <w:b w:val="0"/>
+        </w:rPr>
+        <w:t xml:space="preserve"> US$4.32, about </w:t>
+      </w:r>
+      <w:r>
+        <w:rPr>
+          <w:b/>
+        </w:rPr>
+        <w:t>US$0.22 per account</w:t>
+      </w:r>
+      <w:r>
+        <w:rPr>
+          <w:b w:val="0"/>
+        </w:rPr>
+        <w:t xml:space="preserve"> - twice the</w:t>
+      </w:r>
+    </w:p>
+    <w:p>
+      <w:r>
+        <w:rPr>
+          <w:b w:val="0"/>
+        </w:rPr>
+        <w:t>planning figure (traded US$0.26 / 28 s, others US$0.18 / 21 s); about 165 people added (6-16 per account), LinkedIn</w:t>
+      </w:r>
+    </w:p>
+    <w:p>
+      <w:r>
+        <w:rPr>
+          <w:b w:val="0"/>
+        </w:rPr>
+        <w:t>profiles from search results for 46 of 117 (39%). Ready went from 146 to only 147: most of these accounts still need</w:t>
+      </w:r>
+    </w:p>
+    <w:p>
+      <w:r>
+        <w:rPr>
+          <w:b w:val="0"/>
+        </w:rPr>
+        <w:t>the LinkedIn re-check of their company id (391 accounts in all), which only LinkedIn can do. **1.2.0.12 (Boaz): at</w:t>
+      </w:r>
+    </w:p>
+    <w:p>
+      <w:r>
+        <w:rPr>
+          <w:b w:val="0"/>
+        </w:rPr>
+        <w:t>most 5 people per research** (</w:t>
+      </w:r>
+      <w:r>
+        <w:rPr>
+          <w:rFonts w:ascii="Consolas" w:hAnsi="Consolas"/>
+          <w:b w:val="0"/>
+        </w:rPr>
+        <w:t>LANE_MAX_PEOPLE</w:t>
+      </w:r>
+      <w:r>
+        <w:rPr>
+          <w:b w:val="0"/>
+        </w:rPr>
+        <w:t>), at the seniority levels chosen in Setup, most senior first - asked</w:t>
+      </w:r>
+    </w:p>
+    <w:p>
+      <w:r>
+        <w:rPr>
+          <w:b w:val="0"/>
+        </w:rPr>
+        <w:t>in the prompt and enforced when the people are added.</w:t>
       </w:r>
     </w:p>
     <w:p>

</xml_diff>

<commit_message>
1.2.0.13: the web lane first researches the accounts it can make Ready on its own (only a verified contact missing)
Co-Authored-By: Claude Opus 5.5 <noreply@anthropic.com>
</commit_message>
<xml_diff>
--- a/ONBOARDING_RESEARCH_DESIGN.docx
+++ b/ONBOARDING_RESEARCH_DESIGN.docx
@@ -10841,6 +10841,75 @@
           <w:b w:val="0"/>
         </w:rPr>
         <w:t>in the prompt and enforced when the people are added.</w:t>
+      </w:r>
+    </w:p>
+    <w:p>
+      <w:r>
+        <w:rPr>
+          <w:b/>
+        </w:rPr>
+        <w:t>1.2.0.13 (Boaz):</w:t>
+      </w:r>
+      <w:r>
+        <w:rPr>
+          <w:b w:val="0"/>
+        </w:rPr>
+        <w:t xml:space="preserve"> the web lane first takes the accounts it can make Ready on its own - LinkedIn company verified,</w:t>
+      </w:r>
+    </w:p>
+    <w:p>
+      <w:r>
+        <w:rPr>
+          <w:b w:val="0"/>
+        </w:rPr>
+        <w:t>a verified relevant contact the only thing missing (</w:t>
+      </w:r>
+      <w:r>
+        <w:rPr>
+          <w:rFonts w:ascii="Consolas" w:hAnsi="Consolas"/>
+          <w:b w:val="0"/>
+        </w:rPr>
+        <w:t>onlyContactMissing</w:t>
+      </w:r>
+      <w:r>
+        <w:rPr>
+          <w:b w:val="0"/>
+        </w:rPr>
+        <w:t xml:space="preserve">, </w:t>
+      </w:r>
+      <w:r>
+        <w:rPr>
+          <w:rFonts w:ascii="Consolas" w:hAnsi="Consolas"/>
+          <w:b w:val="0"/>
+        </w:rPr>
+        <w:t>webLaneOrder</w:t>
+      </w:r>
+      <w:r>
+        <w:rPr>
+          <w:b w:val="0"/>
+        </w:rPr>
+        <w:t xml:space="preserve">'s </w:t>
+      </w:r>
+      <w:r>
+        <w:rPr>
+          <w:rFonts w:ascii="Consolas" w:hAnsi="Consolas"/>
+          <w:b w:val="0"/>
+        </w:rPr>
+        <w:t>readyByWeb</w:t>
+      </w:r>
+      <w:r>
+        <w:rPr>
+          <w:b w:val="0"/>
+        </w:rPr>
+        <w:t>) - then</w:t>
+      </w:r>
+    </w:p>
+    <w:p>
+      <w:r>
+        <w:rPr>
+          <w:b w:val="0"/>
+        </w:rPr>
+        <w:t>traded, priority and listing order as before.</w:t>
       </w:r>
     </w:p>
     <w:p>

</xml_diff>

<commit_message>
1.2.0.14: contacts-only web lane researches run on Haiku 4.5 (half the token price); the Activity Log line says Haiku
Co-Authored-By: Claude Opus 5.5 <noreply@anthropic.com>
</commit_message>
<xml_diff>
--- a/ONBOARDING_RESEARCH_DESIGN.docx
+++ b/ONBOARDING_RESEARCH_DESIGN.docx
@@ -10910,6 +10910,103 @@
           <w:b w:val="0"/>
         </w:rPr>
         <w:t>traded, priority and listing order as before.</w:t>
+      </w:r>
+    </w:p>
+    <w:p>
+      <w:r>
+        <w:rPr>
+          <w:b/>
+        </w:rPr>
+        <w:t>Second automatic run (1.2.0.13, 2026-10-01, 20 accounts):</w:t>
+      </w:r>
+      <w:r>
+        <w:rPr>
+          <w:b w:val="0"/>
+        </w:rPr>
+        <w:t xml:space="preserve"> US$4.10, about US$0.205 per account; 72 people</w:t>
+      </w:r>
+    </w:p>
+    <w:p>
+      <w:r>
+        <w:rPr>
+          <w:b w:val="0"/>
+        </w:rPr>
+        <w:t xml:space="preserve">added (the cap works), profiles from search results for 38 of 83 (46%); </w:t>
+      </w:r>
+      <w:r>
+        <w:rPr>
+          <w:b/>
+        </w:rPr>
+        <w:t>Ready 147 -&gt; 158</w:t>
+      </w:r>
+      <w:r>
+        <w:rPr>
+          <w:b w:val="0"/>
+        </w:rPr>
+        <w:t xml:space="preserve"> - about US$0.37 per</w:t>
+      </w:r>
+    </w:p>
+    <w:p>
+      <w:r>
+        <w:rPr>
+          <w:b w:val="0"/>
+        </w:rPr>
+        <w:t>Ready account, no LinkedIn visit. The cap hardly moved the cost: it is the research reading search results and</w:t>
+      </w:r>
+    </w:p>
+    <w:p>
+      <w:r>
+        <w:rPr>
+          <w:b w:val="0"/>
+        </w:rPr>
+        <w:t xml:space="preserve">pages (input), not the people. </w:t>
+      </w:r>
+      <w:r>
+        <w:rPr>
+          <w:b/>
+        </w:rPr>
+        <w:t>1.2.0.14 (Boaz):</w:t>
+      </w:r>
+      <w:r>
+        <w:rPr>
+          <w:b w:val="0"/>
+        </w:rPr>
+        <w:t xml:space="preserve"> a research that asks only for contacts runs on </w:t>
+      </w:r>
+      <w:r>
+        <w:rPr>
+          <w:b/>
+        </w:rPr>
+        <w:t>Haiku 4.5</w:t>
+      </w:r>
+    </w:p>
+    <w:p>
+      <w:r>
+        <w:rPr>
+          <w:b w:val="0"/>
+        </w:rPr>
+        <w:t>(</w:t>
+      </w:r>
+      <w:r>
+        <w:rPr>
+          <w:rFonts w:ascii="Consolas" w:hAnsi="Consolas"/>
+          <w:b w:val="0"/>
+        </w:rPr>
+        <w:t>LANE_CONTACTS_MODEL</w:t>
+      </w:r>
+      <w:r>
+        <w:rPr>
+          <w:b w:val="0"/>
+        </w:rPr>
+        <w:t>, half Sonnet 5's token price; searches unchanged at US$0.01) - expected about US$0.11-0.12 per</w:t>
+      </w:r>
+    </w:p>
+    <w:p>
+      <w:r>
+        <w:rPr>
+          <w:b w:val="0"/>
+        </w:rPr>
+        <w:t>account; the Activity Log line says "Haiku", to compare people and profiles found with the Sonnet runs.</w:t>
       </w:r>
     </w:p>
     <w:p>

</xml_diff>

<commit_message>
1.2.0.16: About you is easy to find - Settings > User Profile points to it ("Open About you"), and Setup opens there until it is filled in
Co-Authored-By: Claude Opus 5.5 <noreply@anthropic.com>
</commit_message>
<xml_diff>
--- a/ONBOARDING_RESEARCH_DESIGN.docx
+++ b/ONBOARDING_RESEARCH_DESIGN.docx
@@ -11631,6 +11631,77 @@
           <w:b w:val="0"/>
         </w:rPr>
         <w:t>run against the real API** - that is Boaz's check: a clean profile with 3 real company websites.</w:t>
+      </w:r>
+    </w:p>
+    <w:p>
+      <w:r>
+        <w:rPr>
+          <w:b/>
+        </w:rPr>
+        <w:t>1.2.0.16 (Boaz, 2026-10-01):</w:t>
+      </w:r>
+      <w:r>
+        <w:rPr>
+          <w:b w:val="0"/>
+        </w:rPr>
+        <w:t xml:space="preserve"> on a setup completed before, nothing led to About you - he looked for the company</w:t>
+      </w:r>
+    </w:p>
+    <w:p>
+      <w:r>
+        <w:rPr>
+          <w:b w:val="0"/>
+        </w:rPr>
+        <w:t>and website in Settings &gt; User Profile (name, title, email), and the wizard opened on the last step reached. Now the</w:t>
+      </w:r>
+    </w:p>
+    <w:p>
+      <w:r>
+        <w:rPr>
+          <w:b w:val="0"/>
+        </w:rPr>
+        <w:t xml:space="preserve">User Profile card says where the company and website are set, with </w:t>
+      </w:r>
+      <w:r>
+        <w:rPr>
+          <w:b/>
+        </w:rPr>
+        <w:t>Open About you</w:t>
+      </w:r>
+      <w:r>
+        <w:rPr>
+          <w:b w:val="0"/>
+        </w:rPr>
+        <w:t xml:space="preserve"> (Change Settings opened on that</w:t>
+      </w:r>
+    </w:p>
+    <w:p>
+      <w:r>
+        <w:rPr>
+          <w:b w:val="0"/>
+        </w:rPr>
+        <w:t xml:space="preserve">one setting, </w:t>
+      </w:r>
+      <w:r>
+        <w:rPr>
+          <w:rFonts w:ascii="Consolas" w:hAnsi="Consolas"/>
+          <w:b w:val="0"/>
+        </w:rPr>
+        <w:t>onboarding.html?mode=settings&amp;step=about</w:t>
+      </w:r>
+      <w:r>
+        <w:rPr>
+          <w:b w:val="0"/>
+        </w:rPr>
+        <w:t>), and Setup opens on About you for an install that has never</w:t>
+      </w:r>
+    </w:p>
+    <w:p>
+      <w:r>
+        <w:rPr>
+          <w:b w:val="0"/>
+        </w:rPr>
+        <w:t>filled it in (no company, no website, no research).</w:t>
       </w:r>
     </w:p>
     <w:p>

</xml_diff>

<commit_message>
1.2.0.17: group websites - the research answers for the named company; the website's own country first, group-only countries named but not ticked
Co-Authored-By: Claude Opus 5.5 <noreply@anthropic.com>
</commit_message>
<xml_diff>
--- a/ONBOARDING_RESEARCH_DESIGN.docx
+++ b/ONBOARDING_RESEARCH_DESIGN.docx
@@ -11702,6 +11702,166 @@
           <w:b w:val="0"/>
         </w:rPr>
         <w:t>filled it in (no company, no website, no research).</w:t>
+      </w:r>
+    </w:p>
+    <w:p>
+      <w:r>
+        <w:rPr>
+          <w:b/>
+        </w:rPr>
+        <w:t>1.2.0.17 (Boaz, 2026-10-01) - group websites.</w:t>
+      </w:r>
+      <w:r>
+        <w:rPr>
+          <w:b w:val="0"/>
+        </w:rPr>
+        <w:t xml:space="preserve"> The first real research (TIMETOACT, a Swiss company on the group's</w:t>
+      </w:r>
+    </w:p>
+    <w:p>
+      <w:r>
+        <w:rPr>
+          <w:b w:val="0"/>
+        </w:rPr>
+        <w:t xml:space="preserve">site </w:t>
+      </w:r>
+      <w:r>
+        <w:rPr>
+          <w:rFonts w:ascii="Consolas" w:hAnsi="Consolas"/>
+          <w:b w:val="0"/>
+        </w:rPr>
+        <w:t>timetoact-group.ch</w:t>
+      </w:r>
+      <w:r>
+        <w:rPr>
+          <w:b w:val="0"/>
+        </w:rPr>
+        <w:t>) proposed the whole group's seven countries; the team sells in Switzerland only. Now the</w:t>
+      </w:r>
+    </w:p>
+    <w:p>
+      <w:r>
+        <w:rPr>
+          <w:b w:val="0"/>
+        </w:rPr>
+        <w:t xml:space="preserve">research answers for the company named on About you, and marks each country </w:t>
+      </w:r>
+      <w:r>
+        <w:rPr>
+          <w:rFonts w:ascii="Consolas" w:hAnsi="Consolas"/>
+          <w:b w:val="0"/>
+        </w:rPr>
+        <w:t>scope: "company"</w:t>
+      </w:r>
+      <w:r>
+        <w:rPr>
+          <w:b w:val="0"/>
+        </w:rPr>
+        <w:t xml:space="preserve"> or </w:t>
+      </w:r>
+      <w:r>
+        <w:rPr>
+          <w:rFonts w:ascii="Consolas" w:hAnsi="Consolas"/>
+          <w:b w:val="0"/>
+        </w:rPr>
+        <w:t>"group"</w:t>
+      </w:r>
+      <w:r>
+        <w:rPr>
+          <w:b w:val="0"/>
+        </w:rPr>
+        <w:t>;</w:t>
+      </w:r>
+    </w:p>
+    <w:p>
+      <w:r>
+        <w:rPr>
+          <w:rFonts w:ascii="Consolas" w:hAnsi="Consolas"/>
+          <w:b w:val="0"/>
+        </w:rPr>
+        <w:t>setup-proposals.js</w:t>
+      </w:r>
+      <w:r>
+        <w:rPr>
+          <w:b w:val="0"/>
+        </w:rPr>
+        <w:t xml:space="preserve"> ticks the website's own country first (country-code domain: </w:t>
+      </w:r>
+      <w:r>
+        <w:rPr>
+          <w:rFonts w:ascii="Consolas" w:hAnsi="Consolas"/>
+          <w:b w:val="0"/>
+        </w:rPr>
+        <w:t>.ch</w:t>
+      </w:r>
+      <w:r>
+        <w:rPr>
+          <w:b w:val="0"/>
+        </w:rPr>
+        <w:t xml:space="preserve"> -&gt; Switzerland, </w:t>
+      </w:r>
+      <w:r>
+        <w:rPr>
+          <w:rFonts w:ascii="Consolas" w:hAnsi="Consolas"/>
+          <w:b w:val="0"/>
+        </w:rPr>
+        <w:t>.co.uk</w:t>
+      </w:r>
+      <w:r>
+        <w:rPr>
+          <w:b w:val="0"/>
+        </w:rPr>
+        <w:t xml:space="preserve"> -&gt;</w:t>
+      </w:r>
+    </w:p>
+    <w:p>
+      <w:r>
+        <w:rPr>
+          <w:b w:val="0"/>
+        </w:rPr>
+        <w:t xml:space="preserve">United Kingdom; </w:t>
+      </w:r>
+      <w:r>
+        <w:rPr>
+          <w:rFonts w:ascii="Consolas" w:hAnsi="Consolas"/>
+          <w:b w:val="0"/>
+        </w:rPr>
+        <w:t>.com</w:t>
+      </w:r>
+      <w:r>
+        <w:rPr>
+          <w:b w:val="0"/>
+        </w:rPr>
+        <w:t>/</w:t>
+      </w:r>
+      <w:r>
+        <w:rPr>
+          <w:rFonts w:ascii="Consolas" w:hAnsi="Consolas"/>
+          <w:b w:val="0"/>
+        </w:rPr>
+        <w:t>.eu</w:t>
+      </w:r>
+      <w:r>
+        <w:rPr>
+          <w:b w:val="0"/>
+        </w:rPr>
+        <w:t xml:space="preserve"> say nothing), then the company's countries, and names the group-only countries in the</w:t>
+      </w:r>
+    </w:p>
+    <w:p>
+      <w:r>
+        <w:rPr>
+          <w:b w:val="0"/>
+        </w:rPr>
+        <w:t>note (*"Countries where only the group works, not ticked: ..."*). The website's country alone is not a finding: with</w:t>
+      </w:r>
+    </w:p>
+    <w:p>
+      <w:r>
+        <w:rPr>
+          <w:b w:val="0"/>
+        </w:rPr>
+        <w:t>no country in the answer the step still says "Nothing found". 7 new checks (445).</w:t>
       </w:r>
     </w:p>
     <w:p>

</xml_diff>

<commit_message>
1.2.0.18: organization types say companies are always included ("Organization types other than companies"), with a hover tip per type
Co-Authored-By: Claude Opus 5.5 <noreply@anthropic.com>
</commit_message>
<xml_diff>
--- a/ONBOARDING_RESEARCH_DESIGN.docx
+++ b/ONBOARDING_RESEARCH_DESIGN.docx
@@ -11862,6 +11862,44 @@
           <w:b w:val="0"/>
         </w:rPr>
         <w:t>no country in the answer the step still says "Nothing found". 7 new checks (445).</w:t>
+      </w:r>
+    </w:p>
+    <w:p>
+      <w:r>
+        <w:rPr>
+          <w:b/>
+        </w:rPr>
+        <w:t>1.2.0.18 (Boaz, 2026-10-01):</w:t>
+      </w:r>
+      <w:r>
+        <w:rPr>
+          <w:b w:val="0"/>
+        </w:rPr>
+        <w:t xml:space="preserve"> the Industry step's organization types read as if private and publicly traded</w:t>
+      </w:r>
+    </w:p>
+    <w:p>
+      <w:r>
+        <w:rPr>
+          <w:b w:val="0"/>
+        </w:rPr>
+        <w:t>companies were missing. Retitled *"Organization types other than companies"*, with the first line saying companies are</w:t>
+      </w:r>
+    </w:p>
+    <w:p>
+      <w:r>
+        <w:rPr>
+          <w:b w:val="0"/>
+        </w:rPr>
+        <w:t>always included, and each type has a hover tip on what it covers (e.g. *Civic and Social Organizations*: associations,</w:t>
+      </w:r>
+    </w:p>
+    <w:p>
+      <w:r>
+        <w:rPr>
+          <w:b w:val="0"/>
+        </w:rPr>
+        <w:t>federations, chambers, clubs).</w:t>
       </w:r>
     </w:p>
     <w:p>

</xml_diff>

<commit_message>
1.2.0.19: offers step says what the items are for (a give-away in a message to a lead); checklist items stay readable - bold when ticked, no strike-through
Co-Authored-By: Claude Opus 5.5 <noreply@anthropic.com>
</commit_message>
<xml_diff>
--- a/ONBOARDING_RESEARCH_DESIGN.docx
+++ b/ONBOARDING_RESEARCH_DESIGN.docx
@@ -11900,6 +11900,36 @@
           <w:b w:val="0"/>
         </w:rPr>
         <w:t>federations, chambers, clubs).</w:t>
+      </w:r>
+    </w:p>
+    <w:p>
+      <w:r>
+        <w:rPr>
+          <w:b/>
+        </w:rPr>
+        <w:t>1.2.0.19 (Boaz, 2026-10-01):</w:t>
+      </w:r>
+      <w:r>
+        <w:rPr>
+          <w:b w:val="0"/>
+        </w:rPr>
+        <w:t xml:space="preserve"> Things you can offer is titled *"What can you offer a lead to start a conversation?"*,</w:t>
+      </w:r>
+    </w:p>
+    <w:p>
+      <w:r>
+        <w:rPr>
+          <w:b w:val="0"/>
+        </w:rPr>
+        <w:t>and its proposal box says what the items are for (a give-away in a message to a lead, a reason to reply). Checklist</w:t>
+      </w:r>
+    </w:p>
+    <w:p>
+      <w:r>
+        <w:rPr>
+          <w:b w:val="0"/>
+        </w:rPr>
+        <w:t>items are no longer struck through when unticked - the text stays normal and a ticked item is bold.</w:t>
       </w:r>
     </w:p>
     <w:p>

</xml_diff>

<commit_message>
1.2.0.20: ticked offers move into the list below on Save; Change Settings has Previous / Next beside Save
Co-Authored-By: Claude Opus 5.5 <noreply@anthropic.com>
</commit_message>
<xml_diff>
--- a/ONBOARDING_RESEARCH_DESIGN.docx
+++ b/ONBOARDING_RESEARCH_DESIGN.docx
@@ -11930,6 +11930,62 @@
           <w:b w:val="0"/>
         </w:rPr>
         <w:t>items are no longer struck through when unticked - the text stays normal and a ticked item is bold.</w:t>
+      </w:r>
+    </w:p>
+    <w:p>
+      <w:r>
+        <w:rPr>
+          <w:b/>
+        </w:rPr>
+        <w:t>1.2.0.20 (Boaz, 2026-10-01):</w:t>
+      </w:r>
+      <w:r>
+        <w:rPr>
+          <w:b w:val="0"/>
+        </w:rPr>
+        <w:t xml:space="preserve"> ticking offers and pressing Save left them in the checklist, so the save looked as if</w:t>
+      </w:r>
+    </w:p>
+    <w:p>
+      <w:r>
+        <w:rPr>
+          <w:b w:val="0"/>
+        </w:rPr>
+        <w:t>it had not worked. The box below is now the list of offers: Save (and coming back to the step) moves the ticked</w:t>
+      </w:r>
+    </w:p>
+    <w:p>
+      <w:r>
+        <w:rPr>
+          <w:b w:val="0"/>
+        </w:rPr>
+        <w:t xml:space="preserve">proposals into it, and the checklist keeps only the proposals not taken yet. Change Settings has </w:t>
+      </w:r>
+      <w:r>
+        <w:rPr>
+          <w:b/>
+        </w:rPr>
+        <w:t>Previous</w:t>
+      </w:r>
+      <w:r>
+        <w:rPr>
+          <w:b w:val="0"/>
+        </w:rPr>
+        <w:t xml:space="preserve"> and</w:t>
+      </w:r>
+    </w:p>
+    <w:p>
+      <w:r>
+        <w:rPr>
+          <w:b/>
+        </w:rPr>
+        <w:t>Next</w:t>
+      </w:r>
+      <w:r>
+        <w:rPr>
+          <w:b w:val="0"/>
+        </w:rPr>
+        <w:t xml:space="preserve"> beside Save again; each saves the open setting first and stays put while it has an error.</w:t>
       </w:r>
     </w:p>
     <w:p>

</xml_diff>

<commit_message>
1.2.0.21: proposed contact titles and keywords work like offers - ticked ones move into their box on Save
Co-Authored-By: Claude Opus 5.5 <noreply@anthropic.com>
</commit_message>
<xml_diff>
--- a/ONBOARDING_RESEARCH_DESIGN.docx
+++ b/ONBOARDING_RESEARCH_DESIGN.docx
@@ -11986,6 +11986,36 @@
           <w:b w:val="0"/>
         </w:rPr>
         <w:t xml:space="preserve"> beside Save again; each saves the open setting first and stays put while it has an error.</w:t>
+      </w:r>
+    </w:p>
+    <w:p>
+      <w:r>
+        <w:rPr>
+          <w:b/>
+        </w:rPr>
+        <w:t>1.2.0.21 (Boaz, 2026-10-01):</w:t>
+      </w:r>
+      <w:r>
+        <w:rPr>
+          <w:b w:val="0"/>
+        </w:rPr>
+        <w:t xml:space="preserve"> Target contacts works the same way: proposed titles and keywords not yet in their box</w:t>
+      </w:r>
+    </w:p>
+    <w:p>
+      <w:r>
+        <w:rPr>
+          <w:b w:val="0"/>
+        </w:rPr>
+        <w:t>are listed above it, and Save moves the ticked ones into the box. The up/down rank of proposed titles is dropped (a</w:t>
+      </w:r>
+    </w:p>
+    <w:p>
+      <w:r>
+        <w:rPr>
+          <w:b w:val="0"/>
+        </w:rPr>
+        <w:t>box keeps the order of its lines) - a deviation from R3.1.5's ranked titles, by Boaz's choice.</w:t>
       </w:r>
     </w:p>
     <w:p>

</xml_diff>

<commit_message>
Design: first measured seller research (US$0.34, 45 s); step 5 done
Co-Authored-By: Claude Opus 5.5 <noreply@anthropic.com>
</commit_message>
<xml_diff>
--- a/ONBOARDING_RESEARCH_DESIGN.docx
+++ b/ONBOARDING_RESEARCH_DESIGN.docx
@@ -12016,6 +12016,42 @@
           <w:b w:val="0"/>
         </w:rPr>
         <w:t>box keeps the order of its lines) - a deviation from R3.1.5's ranked titles, by Boaz's choice.</w:t>
+      </w:r>
+    </w:p>
+    <w:p>
+      <w:r>
+        <w:rPr>
+          <w:b/>
+        </w:rPr>
+        <w:t>First real research (1.2.0.15, 2026-10-01, timetoact-group.ch):</w:t>
+      </w:r>
+      <w:r>
+        <w:rPr>
+          <w:b w:val="0"/>
+        </w:rPr>
+        <w:t xml:space="preserve"> US$0.34, 45 s, 5 pages read, 1 search, proposals</w:t>
+      </w:r>
+    </w:p>
+    <w:p>
+      <w:r>
+        <w:rPr>
+          <w:b w:val="0"/>
+        </w:rPr>
+        <w:t>for all 9 steps - in line with the US$0.30 estimate, which stays until more researches are measured. Boaz went through</w:t>
+      </w:r>
+    </w:p>
+    <w:p>
+      <w:r>
+        <w:rPr>
+          <w:b w:val="0"/>
+        </w:rPr>
+        <w:t xml:space="preserve">every step on 1.2.0.21: no further comments. </w:t>
+      </w:r>
+      <w:r>
+        <w:rPr>
+          <w:b/>
+        </w:rPr>
+        <w:t>Step 5 DONE.</w:t>
       </w:r>
     </w:p>
     <w:p>

</xml_diff>

<commit_message>
1.2.0.22: onboarding step 6 - initiative stages, companies to include, list targets with a live estimate; Finish starts building the list; stop rule and coverage lines
Co-Authored-By: Claude Opus 5.5 <noreply@anthropic.com>
</commit_message>
<xml_diff>
--- a/ONBOARDING_RESEARCH_DESIGN.docx
+++ b/ONBOARDING_RESEARCH_DESIGN.docx
@@ -12052,6 +12052,617 @@
           <w:b/>
         </w:rPr>
         <w:t>Step 5 DONE.</w:t>
+      </w:r>
+    </w:p>
+    <w:p>
+      <w:r>
+        <w:rPr>
+          <w:b/>
+        </w:rPr>
+        <w:t>As built (step 6, 1.2.0.22) - the full onboarding.</w:t>
+      </w:r>
+      <w:r>
+        <w:rPr>
+          <w:b w:val="0"/>
+        </w:rPr>
+        <w:t xml:space="preserve"> Branch </w:t>
+      </w:r>
+      <w:r>
+        <w:rPr>
+          <w:rFonts w:ascii="Consolas" w:hAnsi="Consolas"/>
+          <w:b w:val="0"/>
+        </w:rPr>
+        <w:t>feature/onboarding-step6</w:t>
+      </w:r>
+      <w:r>
+        <w:rPr>
+          <w:b w:val="0"/>
+        </w:rPr>
+        <w:t xml:space="preserve"> (off step 5). The wizard</w:t>
+      </w:r>
+    </w:p>
+    <w:p>
+      <w:r>
+        <w:rPr>
+          <w:b w:val="0"/>
+        </w:rPr>
+        <w:t>now has 15 numbered steps, in the order of 3.1.</w:t>
+      </w:r>
+    </w:p>
+    <w:p>
+      <w:pPr>
+        <w:pStyle w:val="ListBullet"/>
+      </w:pPr>
+      <w:r>
+        <w:rPr>
+          <w:b/>
+        </w:rPr>
+        <w:t>Initiative stages</w:t>
+      </w:r>
+      <w:r>
+        <w:rPr>
+          <w:b w:val="0"/>
+        </w:rPr>
+        <w:t xml:space="preserve"> (step 11, </w:t>
+      </w:r>
+      <w:r>
+        <w:rPr>
+          <w:rFonts w:ascii="Consolas" w:hAnsi="Consolas"/>
+          <w:b w:val="0"/>
+        </w:rPr>
+        <w:t>initiativeStagePreference</w:t>
+      </w:r>
+      <w:r>
+        <w:rPr>
+          <w:b w:val="0"/>
+        </w:rPr>
+        <w:t>): the seven stages as a ranked checklist - tick, and</w:t>
+      </w:r>
+    </w:p>
+    <w:p>
+      <w:r>
+        <w:rPr>
+          <w:b w:val="0"/>
+        </w:rPr>
+        <w:t xml:space="preserve">  move up/down with arrows, each with a one-line tip. At least one must stay ticked. The web lane's prompt names the</w:t>
+      </w:r>
+    </w:p>
+    <w:p>
+      <w:r>
+        <w:rPr>
+          <w:b w:val="0"/>
+        </w:rPr>
+        <w:t xml:space="preserve">  ticked stages in the user's order and asks it to leave out the others (only when they differ from all seven in</w:t>
+      </w:r>
+    </w:p>
+    <w:p>
+      <w:r>
+        <w:rPr>
+          <w:b w:val="0"/>
+        </w:rPr>
+        <w:t xml:space="preserve">  the default order), and an initiative counts towards the target only at a ticked stage; one with no stage</w:t>
+      </w:r>
+    </w:p>
+    <w:p>
+      <w:r>
+        <w:rPr>
+          <w:b w:val="0"/>
+        </w:rPr>
+        <w:t xml:space="preserve">  (imported before 1.2.1) still counts (</w:t>
+      </w:r>
+      <w:r>
+        <w:rPr>
+          <w:rFonts w:ascii="Consolas" w:hAnsi="Consolas"/>
+          <w:b w:val="0"/>
+        </w:rPr>
+        <w:t>initiativeCounts</w:t>
+      </w:r>
+      <w:r>
+        <w:rPr>
+          <w:b w:val="0"/>
+        </w:rPr>
+        <w:t>).</w:t>
+      </w:r>
+    </w:p>
+    <w:p>
+      <w:pPr>
+        <w:pStyle w:val="ListBullet"/>
+      </w:pPr>
+      <w:r>
+        <w:rPr>
+          <w:b/>
+        </w:rPr>
+        <w:t>Companies to include</w:t>
+      </w:r>
+      <w:r>
+        <w:rPr>
+          <w:b w:val="0"/>
+        </w:rPr>
+        <w:t xml:space="preserve"> (step 12, </w:t>
+      </w:r>
+      <w:r>
+        <w:rPr>
+          <w:rFonts w:ascii="Consolas" w:hAnsi="Consolas"/>
+          <w:b w:val="0"/>
+        </w:rPr>
+        <w:t>includedCompanies</w:t>
+      </w:r>
+      <w:r>
+        <w:rPr>
+          <w:b w:val="0"/>
+        </w:rPr>
+        <w:t>): one per line, *"Name, https://website"*, the name alone</w:t>
+      </w:r>
+    </w:p>
+    <w:p>
+      <w:r>
+        <w:rPr>
+          <w:b w:val="0"/>
+        </w:rPr>
+        <w:t xml:space="preserve">  or the website alone. Each line is shown as read; one that is also on the exclusion list is flagged in red and is</w:t>
+      </w:r>
+    </w:p>
+    <w:p>
+      <w:r>
+        <w:rPr>
+          <w:b w:val="0"/>
+        </w:rPr>
+        <w:t xml:space="preserve">  not added (the exclusion wins). Web Discovery adds them first, before any listing, with no web call and no size or</w:t>
+      </w:r>
+    </w:p>
+    <w:p>
+      <w:r>
+        <w:rPr>
+          <w:b w:val="0"/>
+        </w:rPr>
+        <w:t xml:space="preserve">  industry filter; they count towards the accounts it was asked for. The run's report says how many were added,</w:t>
+      </w:r>
+    </w:p>
+    <w:p>
+      <w:r>
+        <w:rPr>
+          <w:b w:val="0"/>
+        </w:rPr>
+        <w:t xml:space="preserve">  already in the list, or left out as excluded.</w:t>
+      </w:r>
+    </w:p>
+    <w:p>
+      <w:pPr>
+        <w:pStyle w:val="ListBullet"/>
+      </w:pPr>
+      <w:r>
+        <w:rPr>
+          <w:b/>
+        </w:rPr>
+        <w:t>How big should your list be?</w:t>
+      </w:r>
+      <w:r>
+        <w:rPr>
+          <w:b w:val="0"/>
+        </w:rPr>
+        <w:t xml:space="preserve"> (step 15, </w:t>
+      </w:r>
+      <w:r>
+        <w:rPr>
+          <w:rFonts w:ascii="Consolas" w:hAnsi="Consolas"/>
+          <w:b w:val="0"/>
+        </w:rPr>
+        <w:t>completionTargets</w:t>
+      </w:r>
+      <w:r>
+        <w:rPr>
+          <w:b w:val="0"/>
+        </w:rPr>
+        <w:t>): accounts (10-2000), contacts per account (1 to the</w:t>
+      </w:r>
+    </w:p>
+    <w:p>
+      <w:r>
+        <w:rPr>
+          <w:b w:val="0"/>
+        </w:rPr>
+        <w:t xml:space="preserve">  Target contacts step's maximum per account) and relevant initiatives per account (0-5); an out-of-range number is</w:t>
+      </w:r>
+    </w:p>
+    <w:p>
+      <w:r>
+        <w:rPr>
+          <w:b w:val="0"/>
+        </w:rPr>
+        <w:t xml:space="preserve">  an error on Next. Below the fields, the live estimate from </w:t>
+      </w:r>
+      <w:r>
+        <w:rPr>
+          <w:b/>
+        </w:rPr>
+        <w:t>`onboarding-estimate.js`</w:t>
+      </w:r>
+      <w:r>
+        <w:rPr>
+          <w:b w:val="0"/>
+        </w:rPr>
+        <w:t xml:space="preserve"> (new pure module): it counts</w:t>
+      </w:r>
+    </w:p>
+    <w:p>
+      <w:r>
+        <w:rPr>
+          <w:b w:val="0"/>
+        </w:rPr>
+        <w:t xml:space="preserve">  the accounts still to find (target minus the live accounts) and still to build (target minus Ready). Its</w:t>
+      </w:r>
+    </w:p>
+    <w:p>
+      <w:r>
+        <w:rPr>
+          <w:b w:val="0"/>
+        </w:rPr>
+        <w:t xml:space="preserve">  defaults are the measured figures, not section 9's first guesses: discovery US$0.02 an account, research</w:t>
+      </w:r>
+    </w:p>
+    <w:p>
+      <w:r>
+        <w:rPr>
+          <w:b w:val="0"/>
+        </w:rPr>
+        <w:t xml:space="preserve">  US$0.12-0.22, 25 s an account over four workers, 2.6 LinkedIn touches an account at 60 a day. For 100 accounts on a</w:t>
+      </w:r>
+    </w:p>
+    <w:p>
+      <w:r>
+        <w:rPr>
+          <w:b w:val="0"/>
+        </w:rPr>
+        <w:t xml:space="preserve">  clean install: *"about 4-5 days of your daily LinkedIn limit and about US$14-24 on your Anthropic API key ... usable</w:t>
+      </w:r>
+    </w:p>
+    <w:p>
+      <w:r>
+        <w:rPr>
+          <w:b w:val="0"/>
+        </w:rPr>
+        <w:t xml:space="preserve">  within the hour"*. Once 20 accounts have gone through a lane on this install, its own average takes over (R8.3,</w:t>
+      </w:r>
+    </w:p>
+    <w:p>
+      <w:r>
+        <w:rPr>
+          <w:b w:val="0"/>
+        </w:rPr>
+        <w:t xml:space="preserve">  key </w:t>
+      </w:r>
+      <w:r>
+        <w:rPr>
+          <w:rFonts w:ascii="Consolas" w:hAnsi="Consolas"/>
+          <w:b w:val="0"/>
+        </w:rPr>
+        <w:t>onboardingMeasures</w:t>
+      </w:r>
+      <w:r>
+        <w:rPr>
+          <w:b w:val="0"/>
+        </w:rPr>
+        <w:t>, added to by the web lane per account and by Web Discovery per run).</w:t>
+      </w:r>
+    </w:p>
+    <w:p>
+      <w:pPr>
+        <w:pStyle w:val="ListBullet"/>
+      </w:pPr>
+      <w:r>
+        <w:rPr>
+          <w:b/>
+        </w:rPr>
+        <w:t>Finish:</w:t>
+      </w:r>
+      <w:r>
+        <w:rPr>
+          <w:b w:val="0"/>
+        </w:rPr>
+        <w:t xml:space="preserve"> the web budget is pre-filled from the estimate, rounded up to whole US$5, never lowered below what is</w:t>
+      </w:r>
+    </w:p>
+    <w:p>
+      <w:r>
+        <w:rPr>
+          <w:b w:val="0"/>
+        </w:rPr>
+        <w:t xml:space="preserve">  set, with a note of the estimate beside it. With automatic preparation ticked, Finish sends</w:t>
+      </w:r>
+    </w:p>
+    <w:p>
+      <w:r>
+        <w:rPr>
+          <w:b w:val="0"/>
+        </w:rPr>
+        <w:t xml:space="preserve">  </w:t>
+      </w:r>
+      <w:r>
+        <w:rPr>
+          <w:rFonts w:ascii="Consolas" w:hAnsi="Consolas"/>
+          <w:b w:val="0"/>
+        </w:rPr>
+        <w:t>ONBOARDING_BUILD_START</w:t>
+      </w:r>
+      <w:r>
+        <w:rPr>
+          <w:b w:val="0"/>
+        </w:rPr>
+        <w:t>: the background (</w:t>
+      </w:r>
+      <w:r>
+        <w:rPr>
+          <w:rFonts w:ascii="Consolas" w:hAnsi="Consolas"/>
+          <w:b w:val="0"/>
+        </w:rPr>
+        <w:t>startOnboardingBuild</w:t>
+      </w:r>
+      <w:r>
+        <w:rPr>
+          <w:b w:val="0"/>
+        </w:rPr>
+        <w:t>, pipeline-runner.js) runs Web Discovery for the</w:t>
+      </w:r>
+    </w:p>
+    <w:p>
+      <w:r>
+        <w:rPr>
+          <w:b w:val="0"/>
+        </w:rPr>
+        <w:t xml:space="preserve">  accounts owed and, when it ends, the web lane for up to the accounts target, both paid from the monthly web budget;</w:t>
+      </w:r>
+    </w:p>
+    <w:p>
+      <w:r>
+        <w:rPr>
+          <w:b w:val="0"/>
+        </w:rPr>
+        <w:t xml:space="preserve">  with nothing to discover the web lane starts at once. The LinkedIn pipeline is kicked as before. Discovery from</w:t>
+      </w:r>
+    </w:p>
+    <w:p>
+      <w:r>
+        <w:rPr>
+          <w:b w:val="0"/>
+        </w:rPr>
+        <w:t xml:space="preserve">  Finish ends with its usual pop-up.</w:t>
+      </w:r>
+    </w:p>
+    <w:p>
+      <w:pPr>
+        <w:pStyle w:val="ListBullet"/>
+      </w:pPr>
+      <w:r>
+        <w:rPr>
+          <w:b/>
+        </w:rPr>
+        <w:t>The stop rule (8):</w:t>
+      </w:r>
+      <w:r>
+        <w:rPr>
+          <w:b w:val="0"/>
+        </w:rPr>
+        <w:t xml:space="preserve"> </w:t>
+      </w:r>
+      <w:r>
+        <w:rPr>
+          <w:rFonts w:ascii="Consolas" w:hAnsi="Consolas"/>
+          <w:b w:val="0"/>
+        </w:rPr>
+        <w:t>targetsStatus</w:t>
+      </w:r>
+      <w:r>
+        <w:rPr>
+          <w:b w:val="0"/>
+        </w:rPr>
+        <w:t xml:space="preserve"> (pipeline-plan.js, pure) counts Ready, Usable and In progress accounts</w:t>
+      </w:r>
+    </w:p>
+    <w:p>
+      <w:r>
+        <w:rPr>
+          <w:b w:val="0"/>
+        </w:rPr>
+        <w:t xml:space="preserve">  against the targets and returns </w:t>
+      </w:r>
+      <w:r>
+        <w:rPr>
+          <w:rFonts w:ascii="Consolas" w:hAnsi="Consolas"/>
+          <w:b w:val="0"/>
+        </w:rPr>
+        <w:t>discover</w:t>
+      </w:r>
+      <w:r>
+        <w:rPr>
+          <w:b w:val="0"/>
+        </w:rPr>
+        <w:t xml:space="preserve"> / </w:t>
+      </w:r>
+      <w:r>
+        <w:rPr>
+          <w:rFonts w:ascii="Consolas" w:hAnsi="Consolas"/>
+          <w:b w:val="0"/>
+        </w:rPr>
+        <w:t>enrich</w:t>
+      </w:r>
+      <w:r>
+        <w:rPr>
+          <w:b w:val="0"/>
+        </w:rPr>
+        <w:t xml:space="preserve"> / </w:t>
+      </w:r>
+      <w:r>
+        <w:rPr>
+          <w:rFonts w:ascii="Consolas" w:hAnsi="Consolas"/>
+          <w:b w:val="0"/>
+        </w:rPr>
+        <w:t>idle</w:t>
+      </w:r>
+      <w:r>
+        <w:rPr>
+          <w:b w:val="0"/>
+        </w:rPr>
+        <w:t>. On every automatic kick (after the setup is</w:t>
+      </w:r>
+    </w:p>
+    <w:p>
+      <w:r>
+        <w:rPr>
+          <w:b w:val="0"/>
+        </w:rPr>
+        <w:t xml:space="preserve">  finished, not paused, web budget available) the pipeline runs Web Discovery quietly for what is owed - **once per</w:t>
+      </w:r>
+    </w:p>
+    <w:p>
+      <w:r>
+        <w:rPr>
+          <w:b w:val="0"/>
+        </w:rPr>
+        <w:t xml:space="preserve">  accounts target** (</w:t>
+      </w:r>
+      <w:r>
+        <w:rPr>
+          <w:rFonts w:ascii="Consolas" w:hAnsi="Consolas"/>
+          <w:b w:val="0"/>
+        </w:rPr>
+        <w:t>discoveryMayRun</w:t>
+      </w:r>
+      <w:r>
+        <w:rPr>
+          <w:b w:val="0"/>
+        </w:rPr>
+        <w:t xml:space="preserve">, key </w:t>
+      </w:r>
+      <w:r>
+        <w:rPr>
+          <w:rFonts w:ascii="Consolas" w:hAnsi="Consolas"/>
+          <w:b w:val="0"/>
+        </w:rPr>
+        <w:t>autoDiscoveryLast</w:t>
+      </w:r>
+      <w:r>
+        <w:rPr>
+          <w:b w:val="0"/>
+        </w:rPr>
+        <w:t>): again only when the target is raised (R6.5) or a</w:t>
+      </w:r>
+    </w:p>
+    <w:p>
+      <w:r>
+        <w:rPr>
+          <w:b w:val="0"/>
+        </w:rPr>
+        <w:t xml:space="preserve">  week later. This bounds the cost when listings have nothing more to give; without it, accounts that wait for a</w:t>
+      </w:r>
+    </w:p>
+    <w:p>
+      <w:r>
+        <w:rPr>
+          <w:b w:val="0"/>
+        </w:rPr>
+        <w:t xml:space="preserve">  decision would make every kick look short. Enrichment needs nothing new: the web lane and the pipeline already</w:t>
+      </w:r>
+    </w:p>
+    <w:p>
+      <w:r>
+        <w:rPr>
+          <w:b w:val="0"/>
+        </w:rPr>
+        <w:t xml:space="preserve">  ask only for what an account lacks, now against the user's targets instead of the defaults.</w:t>
+      </w:r>
+    </w:p>
+    <w:p>
+      <w:pPr>
+        <w:pStyle w:val="ListBullet"/>
+      </w:pPr>
+      <w:r>
+        <w:rPr>
+          <w:b/>
+        </w:rPr>
+        <w:t>Coverage lines (R6.4):</w:t>
+      </w:r>
+      <w:r>
+        <w:rPr>
+          <w:b w:val="0"/>
+        </w:rPr>
+        <w:t xml:space="preserve"> under the Target Accounts pie - *"Your targets - Accounts: 87 of 100 in the list.</w:t>
+      </w:r>
+    </w:p>
+    <w:p>
+      <w:r>
+        <w:rPr>
+          <w:b w:val="0"/>
+        </w:rPr>
+        <w:t xml:space="preserve">  Contacts: 52 of 87 accounts have 3. Initiatives: 40 of 87 accounts have 1 relevant initiative."* (</w:t>
+      </w:r>
+      <w:r>
+        <w:rPr>
+          <w:rFonts w:ascii="Consolas" w:hAnsi="Consolas"/>
+          <w:b w:val="0"/>
+        </w:rPr>
+        <w:t>coverageLines</w:t>
+      </w:r>
+      <w:r>
+        <w:rPr>
+          <w:b w:val="0"/>
+        </w:rPr>
+        <w:t>).</w:t>
+      </w:r>
+    </w:p>
+    <w:p>
+      <w:pPr>
+        <w:pStyle w:val="ListBullet"/>
+      </w:pPr>
+      <w:r>
+        <w:rPr>
+          <w:b w:val="0"/>
+        </w:rPr>
+        <w:t>The three new keys are in the settings backup.</w:t>
+      </w:r>
+    </w:p>
+    <w:p>
+      <w:r>
+        <w:rPr>
+          <w:b w:val="0"/>
+        </w:rPr>
+        <w:t>Checked: new pure-module checks for targets, stages, the stop rule and the estimate (477 in all); the wizard in the chrome.storage stand-in - the new steps, ranking</w:t>
+      </w:r>
+    </w:p>
+    <w:p>
+      <w:r>
+        <w:rPr>
+          <w:b w:val="0"/>
+        </w:rPr>
+        <w:t>and unticking, the exclusion flag, the contacts cap error, the live estimate at 100 and 250 accounts, the budget</w:t>
+      </w:r>
+    </w:p>
+    <w:p>
+      <w:r>
+        <w:rPr>
+          <w:b w:val="0"/>
+        </w:rPr>
+        <w:t xml:space="preserve">pre-fill (US$60 for 250), the confirm summaries, and Finish sending </w:t>
+      </w:r>
+      <w:r>
+        <w:rPr>
+          <w:rFonts w:ascii="Consolas" w:hAnsi="Consolas"/>
+          <w:b w:val="0"/>
+        </w:rPr>
+        <w:t>ONBOARDING_BUILD_START</w:t>
+      </w:r>
+      <w:r>
+        <w:rPr>
+          <w:b w:val="0"/>
+        </w:rPr>
+        <w:t>. **Not yet run in</w:t>
+      </w:r>
+    </w:p>
+    <w:p>
+      <w:r>
+        <w:rPr>
+          <w:b w:val="0"/>
+        </w:rPr>
+        <w:t>Chrome:** the full onboarding in a clean profile with 100 accounts - Boaz's check.</w:t>
       </w:r>
     </w:p>
     <w:p>

</xml_diff>

<commit_message>
1.2.0.23: Use proposal confirms it was used and saved; Companies to include explains it is only for companies wanted regardless of the research
Co-Authored-By: Claude Opus 5.5 <noreply@anthropic.com>
</commit_message>
<xml_diff>
--- a/ONBOARDING_RESEARCH_DESIGN.docx
+++ b/ONBOARDING_RESEARCH_DESIGN.docx
@@ -12663,6 +12663,84 @@
           <w:b w:val="0"/>
         </w:rPr>
         <w:t>Chrome:** the full onboarding in a clean profile with 100 accounts - Boaz's check.</w:t>
+      </w:r>
+    </w:p>
+    <w:p>
+      <w:r>
+        <w:rPr>
+          <w:b/>
+        </w:rPr>
+        <w:t>1.2.0.23 (Boaz, 2026-10-01, during the clean-profile test):</w:t>
+      </w:r>
+      <w:r>
+        <w:rPr>
+          <w:b w:val="0"/>
+        </w:rPr>
+        <w:t xml:space="preserve"> </w:t>
+      </w:r>
+      <w:r>
+        <w:rPr>
+          <w:b/>
+        </w:rPr>
+        <w:t>Use proposal</w:t>
+      </w:r>
+      <w:r>
+        <w:rPr>
+          <w:b w:val="0"/>
+        </w:rPr>
+        <w:t xml:space="preserve"> gave no sign that anything</w:t>
+      </w:r>
+    </w:p>
+    <w:p>
+      <w:r>
+        <w:rPr>
+          <w:b w:val="0"/>
+        </w:rPr>
+        <w:t>happened, nor whether Save was still needed. The button now turns into *"Used ✓"* with a green line: *"The proposal is</w:t>
+      </w:r>
+    </w:p>
+    <w:p>
+      <w:r>
+        <w:rPr>
+          <w:b w:val="0"/>
+        </w:rPr>
+        <w:t>now in the form below and saved - no need to press Save. Change it if you like, or go on with Next."* (the step saves</w:t>
+      </w:r>
+    </w:p>
+    <w:p>
+      <w:r>
+        <w:rPr>
+          <w:b w:val="0"/>
+        </w:rPr>
+        <w:t xml:space="preserve">itself a moment later); on About you, *"German is now your output language and saved"*. </w:t>
+      </w:r>
+      <w:r>
+        <w:rPr>
+          <w:b/>
+        </w:rPr>
+        <w:t>Companies to include</w:t>
+      </w:r>
+      <w:r>
+        <w:rPr>
+          <w:b w:val="0"/>
+        </w:rPr>
+        <w:t xml:space="preserve"> could</w:t>
+      </w:r>
+    </w:p>
+    <w:p>
+      <w:r>
+        <w:rPr>
+          <w:b w:val="0"/>
+        </w:rPr>
+        <w:t>read as "list all your target customers here": it now says SalesTeam builds the target list itself from the setup's</w:t>
+      </w:r>
+    </w:p>
+    <w:p>
+      <w:r>
+        <w:rPr>
+          <w:b w:val="0"/>
+        </w:rPr>
+        <w:t>criteria, and this step is only for companies wanted in the list whether or not the research finds them.</w:t>
       </w:r>
     </w:p>
     <w:p>

</xml_diff>

<commit_message>
1.2.0.23: an automatic Web Discovery is marked done only when it ends, so a reload mid-run restarts it
Co-Authored-By: Claude Opus 5.5 <noreply@anthropic.com>
</commit_message>
<xml_diff>
--- a/ONBOARDING_RESEARCH_DESIGN.docx
+++ b/ONBOARDING_RESEARCH_DESIGN.docx
@@ -12741,6 +12741,55 @@
           <w:b w:val="0"/>
         </w:rPr>
         <w:t>criteria, and this step is only for companies wanted in the list whether or not the research finds them.</w:t>
+      </w:r>
+    </w:p>
+    <w:p>
+      <w:r>
+        <w:rPr>
+          <w:b w:val="0"/>
+        </w:rPr>
+        <w:t>Also in 1.2.0.23: an automatic Web Discovery is marked done for its target (</w:t>
+      </w:r>
+      <w:r>
+        <w:rPr>
+          <w:rFonts w:ascii="Consolas" w:hAnsi="Consolas"/>
+          <w:b w:val="0"/>
+        </w:rPr>
+        <w:t>autoDiscoveryLast</w:t>
+      </w:r>
+      <w:r>
+        <w:rPr>
+          <w:b w:val="0"/>
+        </w:rPr>
+        <w:t xml:space="preserve">) when it </w:t>
+      </w:r>
+      <w:r>
+        <w:rPr>
+          <w:b/>
+        </w:rPr>
+        <w:t>ends</w:t>
+      </w:r>
+      <w:r>
+        <w:rPr>
+          <w:b w:val="0"/>
+        </w:rPr>
+        <w:t>, not</w:t>
+      </w:r>
+    </w:p>
+    <w:p>
+      <w:r>
+        <w:rPr>
+          <w:b w:val="0"/>
+        </w:rPr>
+        <w:t>when it starts - a run cut off by an extension reload is started again by the next kick for what is still owed</w:t>
+      </w:r>
+    </w:p>
+    <w:p>
+      <w:r>
+        <w:rPr>
+          <w:b w:val="0"/>
+        </w:rPr>
+        <w:t>(before, it would have waited a week).</w:t>
       </w:r>
     </w:p>
     <w:p>

</xml_diff>

<commit_message>
1.2.0.24: Exclusions proposal box says what excluding does (never in Target Accounts, never searched; posts marked Irrelevant)
Co-Authored-By: Claude Opus 5.5 <noreply@anthropic.com>
</commit_message>
<xml_diff>
--- a/ONBOARDING_RESEARCH_DESIGN.docx
+++ b/ONBOARDING_RESEARCH_DESIGN.docx
@@ -12790,6 +12790,44 @@
           <w:b w:val="0"/>
         </w:rPr>
         <w:t>(before, it would have waited a week).</w:t>
+      </w:r>
+    </w:p>
+    <w:p>
+      <w:r>
+        <w:rPr>
+          <w:b/>
+        </w:rPr>
+        <w:t>1.2.0.24 (Boaz, 2026-10-01):</w:t>
+      </w:r>
+      <w:r>
+        <w:rPr>
+          <w:b w:val="0"/>
+        </w:rPr>
+        <w:t xml:space="preserve"> the Exclusions step's proposal box says what excluding does: *"An excluded company</w:t>
+      </w:r>
+    </w:p>
+    <w:p>
+      <w:r>
+        <w:rPr>
+          <w:b w:val="0"/>
+        </w:rPr>
+        <w:t>never shows up in your Target Accounts, and its people are never searched for leads. A post from a competitor,</w:t>
+      </w:r>
+    </w:p>
+    <w:p>
+      <w:r>
+        <w:rPr>
+          <w:b w:val="0"/>
+        </w:rPr>
+        <w:t>recruiter, customer or partner that a keyword scan finds is marked Irrelevant."* (Companies excluded as *Other* have no</w:t>
+      </w:r>
+    </w:p>
+    <w:p>
+      <w:r>
+        <w:rPr>
+          <w:b w:val="0"/>
+        </w:rPr>
+        <w:t>such post filter - a keyword-scan post from one of them still comes through; raised with Boaz.)</w:t>
       </w:r>
     </w:p>
     <w:p>

</xml_diff>

<commit_message>
1.2.0.25: companies excluded as Other are filtered out of lead scans too; Exclusions note says an excluded company is never scanned for leads
Co-Authored-By: Claude Opus 5.5 <noreply@anthropic.com>
</commit_message>
<xml_diff>
--- a/ONBOARDING_RESEARCH_DESIGN.docx
+++ b/ONBOARDING_RESEARCH_DESIGN.docx
@@ -12828,6 +12828,98 @@
           <w:b w:val="0"/>
         </w:rPr>
         <w:t>such post filter - a keyword-scan post from one of them still comes through; raised with Boaz.)</w:t>
+      </w:r>
+    </w:p>
+    <w:p>
+      <w:r>
+        <w:rPr>
+          <w:b/>
+        </w:rPr>
+        <w:t>1.2.0.25 (Boaz, 2026-10-01):</w:t>
+      </w:r>
+      <w:r>
+        <w:rPr>
+          <w:b w:val="0"/>
+        </w:rPr>
+        <w:t xml:space="preserve"> a fifth built-in lead filter, *Other Excluded Companies* (</w:t>
+      </w:r>
+      <w:r>
+        <w:rPr>
+          <w:rFonts w:ascii="Consolas" w:hAnsi="Consolas"/>
+          <w:b w:val="0"/>
+        </w:rPr>
+        <w:t>builtin-other-exclusions</w:t>
+      </w:r>
+      <w:r>
+        <w:rPr>
+          <w:b w:val="0"/>
+        </w:rPr>
+        <w:t>,</w:t>
+      </w:r>
+    </w:p>
+    <w:p>
+      <w:r>
+        <w:rPr>
+          <w:b w:val="0"/>
+        </w:rPr>
+        <w:t xml:space="preserve">source list </w:t>
+      </w:r>
+      <w:r>
+        <w:rPr>
+          <w:rFonts w:ascii="Consolas" w:hAnsi="Consolas"/>
+          <w:b w:val="0"/>
+        </w:rPr>
+        <w:t>others</w:t>
+      </w:r>
+      <w:r>
+        <w:rPr>
+          <w:b w:val="0"/>
+        </w:rPr>
+        <w:t xml:space="preserve"> -&gt; category </w:t>
+      </w:r>
+      <w:r>
+        <w:rPr>
+          <w:rFonts w:ascii="Consolas" w:hAnsi="Consolas"/>
+          <w:b w:val="0"/>
+        </w:rPr>
+        <w:t>other</w:t>
+      </w:r>
+      <w:r>
+        <w:rPr>
+          <w:b w:val="0"/>
+        </w:rPr>
+        <w:t xml:space="preserve">, on by default, added to existing installs by the </w:t>
+      </w:r>
+      <w:r>
+        <w:rPr>
+          <w:rFonts w:ascii="Consolas" w:hAnsi="Consolas"/>
+          <w:b w:val="0"/>
+        </w:rPr>
+        <w:t>getNegativeTopics</w:t>
+      </w:r>
+    </w:p>
+    <w:p>
+      <w:r>
+        <w:rPr>
+          <w:b w:val="0"/>
+        </w:rPr>
+        <w:t>backfill), so an excluded company is never a lead whatever its category. The Exclusions note now says: *"An excluded</w:t>
+      </w:r>
+    </w:p>
+    <w:p>
+      <w:r>
+        <w:rPr>
+          <w:b w:val="0"/>
+        </w:rPr>
+        <w:t>company never shows up in your Target Accounts and is never scanned for leads: its people are not searched, and a post</w:t>
+      </w:r>
+    </w:p>
+    <w:p>
+      <w:r>
+        <w:rPr>
+          <w:b w:val="0"/>
+        </w:rPr>
+        <w:t>from it that a keyword scan finds is marked Irrelevant."*</w:t>
       </w:r>
     </w:p>
     <w:p>

</xml_diff>

<commit_message>
1.2.0.26: Targets estimate gives the real Ready count; Change Settings says when automation or web research is off
Co-Authored-By: Claude Opus 5.5 <noreply@anthropic.com>
</commit_message>
<xml_diff>
--- a/ONBOARDING_RESEARCH_DESIGN.docx
+++ b/ONBOARDING_RESEARCH_DESIGN.docx
@@ -12920,6 +12920,52 @@
           <w:b w:val="0"/>
         </w:rPr>
         <w:t>from it that a keyword scan finds is marked Irrelevant."*</w:t>
+      </w:r>
+    </w:p>
+    <w:p>
+      <w:r>
+        <w:rPr>
+          <w:b/>
+        </w:rPr>
+        <w:t>1.2.0.26 (Boaz, 2026-10-01, on his main profile):</w:t>
+      </w:r>
+      <w:r>
+        <w:rPr>
+          <w:b w:val="0"/>
+        </w:rPr>
+        <w:t xml:space="preserve"> the Targets step said *"your list already has 100 Ready accounts"*</w:t>
+      </w:r>
+    </w:p>
+    <w:p>
+      <w:r>
+        <w:rPr>
+          <w:b w:val="0"/>
+        </w:rPr>
+        <w:t>with 121 Ready - it now gives the real count. In Change Settings it also says when automatic preparation or automatic</w:t>
+      </w:r>
+    </w:p>
+    <w:p>
+      <w:r>
+        <w:rPr>
+          <w:b w:val="0"/>
+        </w:rPr>
+        <w:t>web research is off (*"... so SalesTeam does not build the list towards these numbers until you turn it on"*): raising a</w:t>
+      </w:r>
+    </w:p>
+    <w:p>
+      <w:r>
+        <w:rPr>
+          <w:b w:val="0"/>
+        </w:rPr>
+        <w:t>target there otherwise did nothing, silently. (A setup completed before has no Finish button - Change Settings saves</w:t>
+      </w:r>
+    </w:p>
+    <w:p>
+      <w:r>
+        <w:rPr>
+          <w:b w:val="0"/>
+        </w:rPr>
+        <w:t>each setting on its own; the full onboarding is tested in a clean profile.)</w:t>
       </w:r>
     </w:p>
     <w:p>

</xml_diff>

<commit_message>
1.2.0.27: offers on a sibling domain of the same brand count (timetoact.ch -> timetoact-group.ch); a stored research is mapped again
Co-Authored-By: Claude Opus 5.5 <noreply@anthropic.com>
</commit_message>
<xml_diff>
--- a/ONBOARDING_RESEARCH_DESIGN.docx
+++ b/ONBOARDING_RESEARCH_DESIGN.docx
@@ -12966,6 +12966,100 @@
           <w:b w:val="0"/>
         </w:rPr>
         <w:t>each setting on its own; the full onboarding is tested in a clean profile.)</w:t>
+      </w:r>
+    </w:p>
+    <w:p>
+      <w:r>
+        <w:rPr>
+          <w:b/>
+        </w:rPr>
+        <w:t>1.2.0.27 (Boaz, 2026-10-01, clean profile):</w:t>
+      </w:r>
+      <w:r>
+        <w:rPr>
+          <w:b w:val="0"/>
+        </w:rPr>
+        <w:t xml:space="preserve"> Things you can offer said *"Nothing found on timetoact.ch"* and *"16</w:t>
+      </w:r>
+    </w:p>
+    <w:p>
+      <w:r>
+        <w:rPr>
+          <w:b w:val="0"/>
+        </w:rPr>
+        <w:t>more found without a page of their own"*: the website typed was timetoact.ch, but its pages live on the group's</w:t>
+      </w:r>
+    </w:p>
+    <w:p>
+      <w:r>
+        <w:rPr>
+          <w:b w:val="0"/>
+        </w:rPr>
+        <w:t xml:space="preserve">timetoact-group.ch, so every resource failed the own-domain test. </w:t>
+      </w:r>
+      <w:r>
+        <w:rPr>
+          <w:rFonts w:ascii="Consolas" w:hAnsi="Consolas"/>
+          <w:b w:val="0"/>
+        </w:rPr>
+        <w:t>isOnDomain</w:t>
+      </w:r>
+      <w:r>
+        <w:rPr>
+          <w:b w:val="0"/>
+        </w:rPr>
+        <w:t xml:space="preserve"> (setup-proposals.js) now also accepts a</w:t>
+      </w:r>
+    </w:p>
+    <w:p>
+      <w:r>
+        <w:rPr>
+          <w:b/>
+        </w:rPr>
+        <w:t>sibling domain of the same brand</w:t>
+      </w:r>
+      <w:r>
+        <w:rPr>
+          <w:b w:val="0"/>
+        </w:rPr>
+        <w:t xml:space="preserve"> (</w:t>
+      </w:r>
+      <w:r>
+        <w:rPr>
+          <w:rFonts w:ascii="Consolas" w:hAnsi="Consolas"/>
+          <w:b w:val="0"/>
+        </w:rPr>
+        <w:t>sameBrandDomain</w:t>
+      </w:r>
+      <w:r>
+        <w:rPr>
+          <w:b w:val="0"/>
+        </w:rPr>
+        <w:t>): the name parts before the ending are equal (acme.ch / acme.de)</w:t>
+      </w:r>
+    </w:p>
+    <w:p>
+      <w:r>
+        <w:rPr>
+          <w:b w:val="0"/>
+        </w:rPr>
+        <w:t>or one is a hyphen-part of the other (timetoact / timetoact-group), at least 4 letters; any other domain is still</w:t>
+      </w:r>
+    </w:p>
+    <w:p>
+      <w:r>
+        <w:rPr>
+          <w:b w:val="0"/>
+        </w:rPr>
+        <w:t>refused. A research stored before is mapped again from its saved answer when the wizard opens (local, free), so its</w:t>
+      </w:r>
+    </w:p>
+    <w:p>
+      <w:r>
+        <w:rPr>
+          <w:b w:val="0"/>
+        </w:rPr>
+        <w:t>dropped offers come back without a new research. 9 new checks (487).</w:t>
       </w:r>
     </w:p>
     <w:p>

</xml_diff>

<commit_message>
1.2.0.28: the last setup step's button reads "Next: review and finish"
Co-Authored-By: Claude Opus 5.5 <noreply@anthropic.com>
</commit_message>
<xml_diff>
--- a/ONBOARDING_RESEARCH_DESIGN.docx
+++ b/ONBOARDING_RESEARCH_DESIGN.docx
@@ -13060,6 +13060,28 @@
           <w:b w:val="0"/>
         </w:rPr>
         <w:t>dropped offers come back without a new research. 9 new checks (487).</w:t>
+      </w:r>
+    </w:p>
+    <w:p>
+      <w:r>
+        <w:rPr>
+          <w:b/>
+        </w:rPr>
+        <w:t>1.2.0.28 (Boaz, 2026-10-01):</w:t>
+      </w:r>
+      <w:r>
+        <w:rPr>
+          <w:b w:val="0"/>
+        </w:rPr>
+        <w:t xml:space="preserve"> on step 15 of 15 he looked for Finish Setup - it is on the page after Next and Confirm.</w:t>
+      </w:r>
+    </w:p>
+    <w:p>
+      <w:r>
+        <w:rPr>
+          <w:b w:val="0"/>
+        </w:rPr>
+        <w:t>On the last step the button now reads *"Next: review and finish"*.</w:t>
       </w:r>
     </w:p>
     <w:p>

</xml_diff>

<commit_message>
1.2.0.29: Target contacts - on a first setup proposed titles go straight into the boxes; bracketed translations dropped from titles
Co-Authored-By: Claude Opus 5.5 <noreply@anthropic.com>
</commit_message>
<xml_diff>
--- a/ONBOARDING_RESEARCH_DESIGN.docx
+++ b/ONBOARDING_RESEARCH_DESIGN.docx
@@ -13082,6 +13082,81 @@
           <w:b w:val="0"/>
         </w:rPr>
         <w:t>On the last step the button now reads *"Next: review and finish"*.</w:t>
+      </w:r>
+    </w:p>
+    <w:p>
+      <w:r>
+        <w:rPr>
+          <w:b/>
+        </w:rPr>
+        <w:t>1.2.0.29 (Boaz, 2026-10-01) - Target contacts.</w:t>
+      </w:r>
+      <w:r>
+        <w:rPr>
+          <w:b w:val="0"/>
+        </w:rPr>
+        <w:t xml:space="preserve"> On a first setup the proposed titles sat ticked above an empty</w:t>
+      </w:r>
+    </w:p>
+    <w:p>
+      <w:r>
+        <w:rPr>
+          <w:b w:val="0"/>
+        </w:rPr>
+        <w:t>*Exact titles* box and read as "nothing proposed". Now, on a first setup, the proposed titles and keywords go straight</w:t>
+      </w:r>
+    </w:p>
+    <w:p>
+      <w:r>
+        <w:rPr>
+          <w:b w:val="0"/>
+        </w:rPr>
+        <w:t>into their boxes when the step opens, like every other step's proposal; the tick lists stay for a setup completed</w:t>
+      </w:r>
+    </w:p>
+    <w:p>
+      <w:r>
+        <w:rPr>
+          <w:b w:val="0"/>
+        </w:rPr>
+        <w:t>before, where a proposal must not replace what is saved (1.2.0.21). And a title's translation in brackets is dropped</w:t>
+      </w:r>
+    </w:p>
+    <w:p>
+      <w:r>
+        <w:rPr>
+          <w:b w:val="0"/>
+        </w:rPr>
+        <w:t>(</w:t>
+      </w:r>
+      <w:r>
+        <w:rPr>
+          <w:rFonts w:ascii="Consolas" w:hAnsi="Consolas"/>
+          <w:b w:val="0"/>
+        </w:rPr>
+        <w:t>titleWithoutBrackets</w:t>
+      </w:r>
+      <w:r>
+        <w:rPr>
+          <w:b w:val="0"/>
+        </w:rPr>
+        <w:t>): *"Mitglied der Geschäftsleitung (Member of Executive Board)"* would have been searched with</w:t>
+      </w:r>
+    </w:p>
+    <w:p>
+      <w:r>
+        <w:rPr>
+          <w:b w:val="0"/>
+        </w:rPr>
+        <w:t>the brackets and matched nobody. A stored research with bracketed titles is mapped again when the wizard opens. Things</w:t>
+      </w:r>
+    </w:p>
+    <w:p>
+      <w:r>
+        <w:rPr>
+          <w:b w:val="0"/>
+        </w:rPr>
+        <w:t>you can offer is unchanged (asked only for Target contacts). 4 new checks (491).</w:t>
       </w:r>
     </w:p>
     <w:p>

</xml_diff>

<commit_message>
1.2.0.30: Things you can offer - on a first setup the offers found go straight into the list
Co-Authored-By: Claude Opus 5.5 <noreply@anthropic.com>
</commit_message>
<xml_diff>
--- a/ONBOARDING_RESEARCH_DESIGN.docx
+++ b/ONBOARDING_RESEARCH_DESIGN.docx
@@ -13157,6 +13157,36 @@
           <w:b w:val="0"/>
         </w:rPr>
         <w:t>you can offer is unchanged (asked only for Target contacts). 4 new checks (491).</w:t>
+      </w:r>
+    </w:p>
+    <w:p>
+      <w:r>
+        <w:rPr>
+          <w:b/>
+        </w:rPr>
+        <w:t>1.2.0.30 (Boaz, 2026-10-01):</w:t>
+      </w:r>
+      <w:r>
+        <w:rPr>
+          <w:b w:val="0"/>
+        </w:rPr>
+        <w:t xml:space="preserve"> Things you can offer works the same way: on a first setup the offers found go straight</w:t>
+      </w:r>
+    </w:p>
+    <w:p>
+      <w:r>
+        <w:rPr>
+          <w:b w:val="0"/>
+        </w:rPr>
+        <w:t>into the list box (no tick list), and the proposal box says *"They are in the list below: remove any the AI should not</w:t>
+      </w:r>
+    </w:p>
+    <w:p>
+      <w:r>
+        <w:rPr>
+          <w:b w:val="0"/>
+        </w:rPr>
+        <w:t>offer"*. A setup completed before keeps the tick list.</w:t>
       </w:r>
     </w:p>
     <w:p>

</xml_diff>

<commit_message>
1.2.0.31: Onboarding Setup progress counts 15 steps and updates while the wizard runs
Co-Authored-By: Claude Opus 5.5 <noreply@anthropic.com>
</commit_message>
<xml_diff>
--- a/ONBOARDING_RESEARCH_DESIGN.docx
+++ b/ONBOARDING_RESEARCH_DESIGN.docx
@@ -13187,6 +13187,44 @@
           <w:b w:val="0"/>
         </w:rPr>
         <w:t>offer"*. A setup completed before keeps the tick list.</w:t>
+      </w:r>
+    </w:p>
+    <w:p>
+      <w:r>
+        <w:rPr>
+          <w:b/>
+        </w:rPr>
+        <w:t>1.2.0.31 (Boaz, 2026-10-01):</w:t>
+      </w:r>
+      <w:r>
+        <w:rPr>
+          <w:b w:val="0"/>
+        </w:rPr>
+        <w:t xml:space="preserve"> the Settings menu said *"Onboarding Setup (not started)"* while he was on step 10, and he</w:t>
+      </w:r>
+    </w:p>
+    <w:p>
+      <w:r>
+        <w:rPr>
+          <w:b w:val="0"/>
+        </w:rPr>
+        <w:t>ended up in Change Settings (no numbers, no Finish Setup). The progress label counted 11 steps (15 since step 6) and was</w:t>
+      </w:r>
+    </w:p>
+    <w:p>
+      <w:r>
+        <w:rPr>
+          <w:b w:val="0"/>
+        </w:rPr>
+        <w:t>drawn only when the Settings page opened, never while the wizard ran inside it; it now uses 15 and is redrawn whenever</w:t>
+      </w:r>
+    </w:p>
+    <w:p>
+      <w:r>
+        <w:rPr>
+          <w:b w:val="0"/>
+        </w:rPr>
+        <w:t>the wizard saves its progress or the setup is finished.</w:t>
       </w:r>
     </w:p>
     <w:p>

</xml_diff>

<commit_message>
1.2.0.32: a LinkedIn login wall stops the pipeline and asks the user to log in, instead of counting accounts as not found
Co-Authored-By: Claude Opus 5.5 <noreply@anthropic.com>
</commit_message>
<xml_diff>
--- a/ONBOARDING_RESEARCH_DESIGN.docx
+++ b/ONBOARDING_RESEARCH_DESIGN.docx
@@ -13225,6 +13225,130 @@
           <w:b w:val="0"/>
         </w:rPr>
         <w:t>the wizard saves its progress or the setup is finished.</w:t>
+      </w:r>
+    </w:p>
+    <w:p>
+      <w:r>
+        <w:rPr>
+          <w:b/>
+        </w:rPr>
+        <w:t>Clean-profile run (1.2.0.30, 2026-10-01, timetoact.ch, target 100):</w:t>
+      </w:r>
+      <w:r>
+        <w:rPr>
+          <w:b w:val="0"/>
+        </w:rPr>
+        <w:t xml:space="preserve"> Web Discovery added **100 accounts for US$0.63</w:t>
+      </w:r>
+    </w:p>
+    <w:p>
+      <w:r>
+        <w:rPr>
+          <w:b w:val="0"/>
+        </w:rPr>
+        <w:t>(about US$0.006 each)** - five companydata.com listings (25 rows each, about US$0.065 a listing) and one fit search; 158</w:t>
+      </w:r>
+    </w:p>
+    <w:p>
+      <w:r>
+        <w:rPr>
+          <w:b w:val="0"/>
+        </w:rPr>
+        <w:t>rows read, 32 outside the sizes, 26 listed twice. Within the first stretch 94 of the 100 were Usable (web only). But the</w:t>
+      </w:r>
+    </w:p>
+    <w:p>
+      <w:r>
+        <w:rPr>
+          <w:b w:val="0"/>
+        </w:rPr>
+        <w:t xml:space="preserve">LinkedIn lookups reported *"0 found, 15 looked up but not found"* - the test browser was </w:t>
+      </w:r>
+      <w:r>
+        <w:rPr>
+          <w:b/>
+        </w:rPr>
+        <w:t>not logged in to LinkedIn</w:t>
+      </w:r>
+      <w:r>
+        <w:rPr>
+          <w:b w:val="0"/>
+        </w:rPr>
+        <w:t>.</w:t>
+      </w:r>
+    </w:p>
+    <w:p>
+      <w:r>
+        <w:rPr>
+          <w:b/>
+        </w:rPr>
+        <w:t>1.2.0.32 - LinkedIn logged out.</w:t>
+      </w:r>
+      <w:r>
+        <w:rPr>
+          <w:b w:val="0"/>
+        </w:rPr>
+        <w:t xml:space="preserve"> Every lookup landed on LinkedIn's login wall and was counted as "not found" (a</w:t>
+      </w:r>
+    </w:p>
+    <w:p>
+      <w:r>
+        <w:rPr>
+          <w:b w:val="0"/>
+        </w:rPr>
+        <w:t>failed day each). Now a page ending on the login wall (</w:t>
+      </w:r>
+      <w:r>
+        <w:rPr>
+          <w:rFonts w:ascii="Consolas" w:hAnsi="Consolas"/>
+          <w:b w:val="0"/>
+        </w:rPr>
+        <w:t>isLinkedinLoginWall</w:t>
+      </w:r>
+      <w:r>
+        <w:rPr>
+          <w:b w:val="0"/>
+        </w:rPr>
+        <w:t>: /authwall, /login, /uas/login,</w:t>
+      </w:r>
+    </w:p>
+    <w:p>
+      <w:r>
+        <w:rPr>
+          <w:b w:val="0"/>
+        </w:rPr>
+        <w:t>/checkpoint, /signup) stops the run (*"LinkedIn is not logged in in this browser - log in at linkedin.com"*), counts</w:t>
+      </w:r>
+    </w:p>
+    <w:p>
+      <w:r>
+        <w:rPr>
+          <w:b w:val="0"/>
+        </w:rPr>
+        <w:t>nothing against the account (no attempt mark, no failed day, last run day unchanged), and stores</w:t>
+      </w:r>
+    </w:p>
+    <w:p>
+      <w:r>
+        <w:rPr>
+          <w:rFonts w:ascii="Consolas" w:hAnsi="Consolas"/>
+          <w:b w:val="0"/>
+        </w:rPr>
+        <w:t>linkedinLoggedOutAt</w:t>
+      </w:r>
+      <w:r>
+        <w:rPr>
+          <w:b w:val="0"/>
+        </w:rPr>
+        <w:t>: for 30 minutes LinkedIn work counts as used up (web work goes on), then one page visit tries</w:t>
+      </w:r>
+    </w:p>
+    <w:p>
+      <w:r>
+        <w:rPr>
+          <w:b w:val="0"/>
+        </w:rPr>
+        <w:t>again. The top bar says so with the time it tries again. 12 new checks (503).</w:t>
       </w:r>
     </w:p>
     <w:p>

</xml_diff>

<commit_message>
1.2.0.33: Setup complete link reads "Finish Setup and back to menu"; Change Settings' Back to menu no longer shows in the first setup
Co-Authored-By: Claude Opus 5.5 <noreply@anthropic.com>
</commit_message>
<xml_diff>
--- a/ONBOARDING_RESEARCH_DESIGN.docx
+++ b/ONBOARDING_RESEARCH_DESIGN.docx
@@ -13349,6 +13349,83 @@
           <w:b w:val="0"/>
         </w:rPr>
         <w:t>again. The top bar says so with the time it tries again. 12 new checks (503).</w:t>
+      </w:r>
+    </w:p>
+    <w:p>
+      <w:r>
+        <w:rPr>
+          <w:b/>
+        </w:rPr>
+        <w:t>1.2.0.33 (Boaz, 2026-10-01) - the two "Back to menu" links.</w:t>
+      </w:r>
+      <w:r>
+        <w:rPr>
+          <w:b w:val="0"/>
+        </w:rPr>
+        <w:t xml:space="preserve"> The one on the Setup complete page ran Finish Setup</w:t>
+      </w:r>
+    </w:p>
+    <w:p>
+      <w:r>
+        <w:rPr>
+          <w:b w:val="0"/>
+        </w:rPr>
+        <w:t>without saying so; it now reads *"Finish Setup and back to menu"*. The one at the top belongs to Change Settings, but a</w:t>
+      </w:r>
+    </w:p>
+    <w:p>
+      <w:r>
+        <w:rPr>
+          <w:b w:val="0"/>
+        </w:rPr>
+        <w:t>style rule (</w:t>
+      </w:r>
+      <w:r>
+        <w:rPr>
+          <w:rFonts w:ascii="Consolas" w:hAnsi="Consolas"/>
+          <w:b w:val="0"/>
+        </w:rPr>
+        <w:t>display: inline-block</w:t>
+      </w:r>
+      <w:r>
+        <w:rPr>
+          <w:b w:val="0"/>
+        </w:rPr>
+        <w:t xml:space="preserve">) overrode its </w:t>
+      </w:r>
+      <w:r>
+        <w:rPr>
+          <w:rFonts w:ascii="Consolas" w:hAnsi="Consolas"/>
+          <w:b w:val="0"/>
+        </w:rPr>
+        <w:t>hidden</w:t>
+      </w:r>
+      <w:r>
+        <w:rPr>
+          <w:b w:val="0"/>
+        </w:rPr>
+        <w:t xml:space="preserve"> attribute, so it also showed during the first setup; it is</w:t>
+      </w:r>
+    </w:p>
+    <w:p>
+      <w:r>
+        <w:rPr>
+          <w:b w:val="0"/>
+        </w:rPr>
+        <w:t>hidden there now (</w:t>
+      </w:r>
+      <w:r>
+        <w:rPr>
+          <w:rFonts w:ascii="Consolas" w:hAnsi="Consolas"/>
+          <w:b w:val="0"/>
+        </w:rPr>
+        <w:t>.wizard-back-link[hidden]</w:t>
+      </w:r>
+      <w:r>
+        <w:rPr>
+          <w:b w:val="0"/>
+        </w:rPr>
+        <w:t>). The first setup leaves with *Exit to menu* or *Save &amp; Exit*.</w:t>
       </w:r>
     </w:p>
     <w:p>

</xml_diff>